<commit_message>
backup: Exotic monitor 2026-09-01
</commit_message>
<xml_diff>
--- a/McFarlane_Exotic_Watch_PRD.docx
+++ b/McFarlane_Exotic_Watch_PRD.docx
@@ -10,64 +10,106 @@
         <w:t>Product Requirements Document — McFarlane Exotic Watch</w:t>
       </w:r>
     </w:p>
-    <w:p/>
     <w:p>
       <w:r>
-        <w:t xml:space="preserve">**Version:** 1.0  </w:t>
+        <w:t xml:space="preserve">Version: 2.0  </w:t>
       </w:r>
     </w:p>
     <w:p>
       <w:r>
-        <w:t xml:space="preserve">**Last updated:** 2026-08-26 10:50 EDT  </w:t>
+        <w:t xml:space="preserve">Last updated: 2026-09-01 EDT  </w:t>
       </w:r>
     </w:p>
     <w:p>
       <w:r>
-        <w:t xml:space="preserve">**Status:** Active / implemented baseline  </w:t>
+        <w:t xml:space="preserve">Implementation signature: `8baf19b07a9a`  </w:t>
       </w:r>
     </w:p>
     <w:p>
       <w:r>
-        <w:t>**System of record:** `C:/Users/jltfo/AppData/Local/hermes/price-watches/mcfarlane-exotics.json`</w:t>
+        <w:t xml:space="preserve">Status: Active, deterministic implementation  </w:t>
       </w:r>
     </w:p>
-    <w:p/>
+    <w:p>
+      <w:r>
+        <w:t>Private state: `C:/Users/jltfo/AppData/Local/hermes/price-watches/mcfarlane-exotics.json`</w:t>
+      </w:r>
+    </w:p>
     <w:p>
       <w:pPr>
         <w:pStyle w:val="Heading1"/>
       </w:pPr>
       <w:r>
-        <w:t>1. Purpose</w:t>
+        <w:t>Purpose</w:t>
       </w:r>
     </w:p>
-    <w:p/>
     <w:p>
       <w:r>
-        <w:t>Monitor McFarlane Toys Digital marketplace collections for active **buy-now** listings with **Rarity = Exotic**, retain a verified historical last-Exotic-sale reference, and deliver clear, low-noise updates through Discord and WhatsApp.</w:t>
+        <w:t>Monitor the configured McFarlane Toys Digital collections for active BUY NOW listings whose product-page trait is Rarity: Exotic. Preserve verified listings and historical Exotic-sale context, publish an every-run Discord report, and send WhatsApp only for verified listing changes.</w:t>
       </w:r>
     </w:p>
-    <w:p/>
-    <w:p>
-      <w:r>
-        <w:t>The product must let the user immediately identify collections that have an active Exotic listing while preserving detailed NFT identity data privately for reliable verification and comparison.</w:t>
-      </w:r>
-    </w:p>
-    <w:p/>
     <w:p>
       <w:pPr>
         <w:pStyle w:val="Heading1"/>
       </w:pPr>
       <w:r>
-        <w:t>2. Goals</w:t>
+        <w:t>Scope and safeguards</w:t>
       </w:r>
     </w:p>
-    <w:p/>
     <w:p>
       <w:pPr>
-        <w:pStyle w:val="ListNumber"/>
+        <w:pStyle w:val="ListBullet"/>
       </w:pPr>
       <w:r>
-        <w:t>Check the configured collections at 12:00 AM, 8:00 AM, 12:00 PM, 4:00 PM, and 8:00 PM Eastern Time.</w:t>
+        <w:t>Tracks the ten configured collections held privately in the state file.</w:t>
+      </w:r>
+    </w:p>
+    <w:p>
+      <w:pPr>
+        <w:pStyle w:val="ListBullet"/>
+      </w:pPr>
+      <w:r>
+        <w:t>Counts BUY NOW listings only; bids, wallet actions, purchases, and payment UI are out of scope.</w:t>
+      </w:r>
+    </w:p>
+    <w:p>
+      <w:pPr>
+        <w:pStyle w:val="ListBullet"/>
+      </w:pPr>
+      <w:r>
+        <w:t>Runs at 00:00, 08:00, 12:00, 16:00, and 20:00 Eastern; WhatsApp delivery is scheduled 15 minutes after each main interval.</w:t>
+      </w:r>
+    </w:p>
+    <w:p>
+      <w:pPr>
+        <w:pStyle w:val="ListBullet"/>
+      </w:pPr>
+      <w:r>
+        <w:t>Uses a dedicated, isolated headless Chrome profile only—not the user's normal Chrome profile.</w:t>
+      </w:r>
+    </w:p>
+    <w:p>
+      <w:pPr>
+        <w:pStyle w:val="ListBullet"/>
+      </w:pPr>
+      <w:r>
+        <w:t>Navigates serially with at least a 10-second gap between every marketplace navigation, including product-trait checks.</w:t>
+      </w:r>
+    </w:p>
+    <w:p>
+      <w:pPr>
+        <w:pStyle w:val="ListBullet"/>
+      </w:pPr>
+      <w:r>
+        <w:t>Stops marketplace-wide work only for explicit 429, CAPTCHA/challenge, or access-denied evidence. Redirects, loading shells, missing controls, and timeouts are collection-local failures.</w:t>
+      </w:r>
+    </w:p>
+    <w:p>
+      <w:pPr>
+        <w:pStyle w:val="Heading1"/>
+      </w:pPr>
+      <w:r>
+        <w:t>Collection verification workflow</w:t>
       </w:r>
     </w:p>
     <w:p>
@@ -75,7 +117,7 @@
         <w:pStyle w:val="ListNumber"/>
       </w:pPr>
       <w:r>
-        <w:t>Track only active buy-now Exotic listings; never treat open bids as availability.</w:t>
+        <w:t>Connect to the dedicated Chrome DevTools endpoint.</w:t>
       </w:r>
     </w:p>
     <w:p>
@@ -83,7 +125,7 @@
         <w:pStyle w:val="ListNumber"/>
       </w:pPr>
       <w:r>
-        <w:t>Preserve last-known-good data when a page fails, renders partially, redirects, or is blocked.</w:t>
+        <w:t>Close abandoned pages in the dedicated monitor profile before beginning a run.</w:t>
       </w:r>
     </w:p>
     <w:p>
@@ -91,7 +133,7 @@
         <w:pStyle w:val="ListNumber"/>
       </w:pPr>
       <w:r>
-        <w:t>Make active listings visually prominent in both Discord and WhatsApp.</w:t>
+        <w:t>For each saved filtered collection URL, verify the canonical URL retains its requested Exotic and in-stock filter parameters.</w:t>
       </w:r>
     </w:p>
     <w:p>
@@ -99,7 +141,7 @@
         <w:pStyle w:val="ListNumber"/>
       </w:pPr>
       <w:r>
-        <w:t>Deliver Discord status on every scheduled check; deliver WhatsApp only when verified data changed.</w:t>
+        <w:t>Extract only cards clearly marked BUY NOW.</w:t>
       </w:r>
     </w:p>
     <w:p>
@@ -107,7 +149,7 @@
         <w:pStyle w:val="ListNumber"/>
       </w:pPr>
       <w:r>
-        <w:t>Avoid excessive marketplace traffic and reduce bot/rate-limit risk through strictly serial pacing.</w:t>
+        <w:t>For every active candidate, open its product page and require a rendered `Rarity: Exotic` trait before accepting it.</w:t>
       </w:r>
     </w:p>
     <w:p>
@@ -115,25 +157,31 @@
         <w:pStyle w:val="ListNumber"/>
       </w:pPr>
       <w:r>
-        <w:t>Keep internal token/item detail available for validation while excluding it from user-facing status output.</w:t>
+        <w:t>Normalize listings by token identity, price, currency, and stable private name. Presentation-only card text changes must not create an alert.</w:t>
       </w:r>
     </w:p>
-    <w:p/>
+    <w:p>
+      <w:pPr>
+        <w:pStyle w:val="ListNumber"/>
+      </w:pPr>
+      <w:r>
+        <w:t>Retain last-known-good rows on unavailable/partial results and continue with the other collections.</w:t>
+      </w:r>
+    </w:p>
+    <w:p>
+      <w:pPr>
+        <w:pStyle w:val="ListNumber"/>
+      </w:pPr>
+      <w:r>
+        <w:t>Enforce a bounded run budget. If insufficient time remains, return a safe partial result rather than timing out.</w:t>
+      </w:r>
+    </w:p>
     <w:p>
       <w:pPr>
         <w:pStyle w:val="Heading1"/>
       </w:pPr>
       <w:r>
-        <w:t>3. Non-goals and boundaries</w:t>
-      </w:r>
-    </w:p>
-    <w:p/>
-    <w:p>
-      <w:pPr>
-        <w:pStyle w:val="ListBullet"/>
-      </w:pPr>
-      <w:r>
-        <w:t>Do not buy, bid, connect a wallet, authenticate to payment UI, or otherwise transact.</w:t>
+        <w:t>Change confirmation and state</w:t>
       </w:r>
     </w:p>
     <w:p>
@@ -141,7 +189,7 @@
         <w:pStyle w:val="ListBullet"/>
       </w:pPr>
       <w:r>
-        <w:t>Do not track bid-only listings.</w:t>
+        <w:t>A newly observed listing, disappearance, count change, token change, price change, or currency change is first held as a candidate.</w:t>
       </w:r>
     </w:p>
     <w:p>
@@ -149,7 +197,7 @@
         <w:pStyle w:val="ListBullet"/>
       </w:pPr>
       <w:r>
-        <w:t>Do not infer a rarity from a collection floor price.</w:t>
+        <w:t>The same normalized difference must appear in the next independent interval before it becomes a verified change.</w:t>
       </w:r>
     </w:p>
     <w:p>
@@ -157,7 +205,7 @@
         <w:pStyle w:val="ListBullet"/>
       </w:pPr>
       <w:r>
-        <w:t>Do not report an unverified listing, sale, or failed result as factual.</w:t>
+        <w:t>Candidate or failed observations never overwrite a verified baseline and never create a WhatsApp event.</w:t>
       </w:r>
     </w:p>
     <w:p>
@@ -165,7 +213,7 @@
         <w:pStyle w:val="ListBullet"/>
       </w:pPr>
       <w:r>
-        <w:t>Do not expose marketplace token IDs, item names, token URLs, contract IDs, or raw source URLs in routine user-facing status messages.</w:t>
+        <w:t>Verified changes create a deduplicated pending WhatsApp event; delivery records its fingerprint so it cannot send twice.</w:t>
       </w:r>
     </w:p>
     <w:p>
@@ -173,31 +221,105 @@
         <w:pStyle w:val="ListBullet"/>
       </w:pPr>
       <w:r>
-        <w:t>Never send a WhatsApp message for a no-change check or failure-only check.</w:t>
+        <w:t>The collection Activity view remains authoritative for the saved last Exotic-sale price/time. Product pages verify the trait only.</w:t>
       </w:r>
     </w:p>
-    <w:p/>
     <w:p>
       <w:pPr>
         <w:pStyle w:val="Heading1"/>
       </w:pPr>
       <w:r>
-        <w:t>4. Current scope</w:t>
+        <w:t>Notifications</w:t>
       </w:r>
     </w:p>
-    <w:p/>
+    <w:p>
+      <w:pPr>
+        <w:pStyle w:val="Heading2"/>
+      </w:pPr>
+      <w:r>
+        <w:t>Discord</w:t>
+      </w:r>
+    </w:p>
     <w:p>
       <w:r>
-        <w:t>The watch currently contains 10 collections. Collection identifiers and source URLs are stored only in the JSON state file. The public display names are:</w:t>
+        <w:t>Discord receives every primary interval report.</w:t>
       </w:r>
     </w:p>
-    <w:p/>
     <w:p>
       <w:pPr>
-        <w:pStyle w:val="ListNumber"/>
+        <w:pStyle w:val="ListBullet"/>
       </w:pPr>
       <w:r>
-        <w:t>Batman Beyond</w:t>
+        <w:t>No verified change: active listings only.</w:t>
+      </w:r>
+    </w:p>
+    <w:p>
+      <w:pPr>
+        <w:pStyle w:val="ListBullet"/>
+      </w:pPr>
+      <w:r>
+        <w:t>Verified change: complete collection status.</w:t>
+      </w:r>
+    </w:p>
+    <w:p>
+      <w:pPr>
+        <w:pStyle w:val="ListBullet"/>
+      </w:pPr>
+      <w:r>
+        <w:t>Partial run: identifies unavailable collections and confirms their last-known-good data was retained.</w:t>
+      </w:r>
+    </w:p>
+    <w:p>
+      <w:pPr>
+        <w:pStyle w:val="ListBullet"/>
+      </w:pPr>
+      <w:r>
+        <w:t>Public formatting uses `POL`, green emphasis for active rows, `last:` for historical sales, and masked no-preview View links.</w:t>
+      </w:r>
+    </w:p>
+    <w:p>
+      <w:pPr>
+        <w:pStyle w:val="Heading2"/>
+      </w:pPr>
+      <w:r>
+        <w:t>WhatsApp</w:t>
+      </w:r>
+    </w:p>
+    <w:p>
+      <w:r>
+        <w:t>WhatsApp receives only a verified, undelivered change event.</w:t>
+      </w:r>
+    </w:p>
+    <w:p>
+      <w:pPr>
+        <w:pStyle w:val="ListBullet"/>
+      </w:pPr>
+      <w:r>
+        <w:t>No change, candidate-only result, or failure-only result returns `[SILENT]`.</w:t>
+      </w:r>
+    </w:p>
+    <w:p>
+      <w:pPr>
+        <w:pStyle w:val="ListBullet"/>
+      </w:pPr>
+      <w:r>
+        <w:t>Messages contain no URLs, token IDs, contract IDs, or NFT item names.</w:t>
+      </w:r>
+    </w:p>
+    <w:p>
+      <w:pPr>
+        <w:pStyle w:val="ListBullet"/>
+      </w:pPr>
+      <w:r>
+        <w:t>Active rows use `🟢 YES`, `POL`, and `Last:`.</w:t>
+      </w:r>
+    </w:p>
+    <w:p>
+      <w:pPr>
+        <w:pStyle w:val="Heading1"/>
+      </w:pPr>
+      <w:r>
+        <w:t>Reliability requirements</w:t>
       </w:r>
     </w:p>
     <w:p>
@@ -205,7 +327,7 @@
         <w:pStyle w:val="ListNumber"/>
       </w:pPr>
       <w:r>
-        <w:t>Lobo's Spacehog</w:t>
+        <w:t>Dedicated Chrome is reset independently of the user's browser when its monitor-only profile becomes unhealthy.</w:t>
       </w:r>
     </w:p>
     <w:p>
@@ -213,7 +335,7 @@
         <w:pStyle w:val="ListNumber"/>
       </w:pPr>
       <w:r>
-        <w:t>Superman Action Comics #1</w:t>
+        <w:t>Every run removes stale monitor tabs before collection work.</w:t>
       </w:r>
     </w:p>
     <w:p>
@@ -221,7 +343,7 @@
         <w:pStyle w:val="ListNumber"/>
       </w:pPr>
       <w:r>
-        <w:t>Doomsday</w:t>
+        <w:t>Connection, navigation, loading, product-trait, and budget failures retain state and report partial status rather than producing a false change.</w:t>
       </w:r>
     </w:p>
     <w:p>
@@ -229,7 +351,7 @@
         <w:pStyle w:val="ListNumber"/>
       </w:pPr>
       <w:r>
-        <w:t>Batman by Todd McFarlane</w:t>
+        <w:t>No change can be promoted or delivered unless it survives independent-interval confirmation.</w:t>
       </w:r>
     </w:p>
     <w:p>
@@ -237,1139 +359,30 @@
         <w:pStyle w:val="ListNumber"/>
       </w:pPr>
       <w:r>
-        <w:t>Martian Manhunter</w:t>
+        <w:t>The monitor's Discord and WhatsApp delivery stages are deterministic no-agent scripts; browser collection does not require an LLM runtime.</w:t>
       </w:r>
     </w:p>
-    <w:p>
-      <w:pPr>
-        <w:pStyle w:val="ListNumber"/>
-      </w:pPr>
-      <w:r>
-        <w:t>Knightfall</w:t>
-      </w:r>
-    </w:p>
-    <w:p>
-      <w:pPr>
-        <w:pStyle w:val="ListNumber"/>
-      </w:pPr>
-      <w:r>
-        <w:t>Batman Year 2: Designed by Todd McFarlane</w:t>
-      </w:r>
-    </w:p>
-    <w:p>
-      <w:pPr>
-        <w:pStyle w:val="ListNumber"/>
-      </w:pPr>
-      <w:r>
-        <w:t>Bane: Knight Fall</w:t>
-      </w:r>
-    </w:p>
-    <w:p>
-      <w:pPr>
-        <w:pStyle w:val="ListNumber"/>
-      </w:pPr>
-      <w:r>
-        <w:t>Jim Lee's Superman</w:t>
-      </w:r>
-    </w:p>
-    <w:p/>
     <w:p>
       <w:pPr>
         <w:pStyle w:val="Heading1"/>
       </w:pPr>
       <w:r>
-        <w:t>5. Source and filter requirements</w:t>
-      </w:r>
-    </w:p>
-    <w:p/>
-    <w:p>
-      <w:pPr>
-        <w:pStyle w:val="Heading2"/>
-      </w:pPr>
-      <w:r>
-        <w:t>5.1 Listing source</w:t>
-      </w:r>
-    </w:p>
-    <w:p/>
-    <w:p>
-      <w:pPr>
-        <w:pStyle w:val="ListBullet"/>
-      </w:pPr>
-      <w:r>
-        <w:t>Marketplace: McFarlane Toys Digital.</w:t>
-      </w:r>
-    </w:p>
-    <w:p>
-      <w:pPr>
-        <w:pStyle w:val="ListBullet"/>
-      </w:pPr>
-      <w:r>
-        <w:t>Each collection has an exact, stored filtered source URL.</w:t>
-      </w:r>
-    </w:p>
-    <w:p>
-      <w:pPr>
-        <w:pStyle w:val="ListBullet"/>
-      </w:pPr>
-      <w:r>
-        <w:t>The URL must request `inStockOnly=true` and `traits[Rarity][0]=Exotic` (encoded form is acceptable).</w:t>
-      </w:r>
-    </w:p>
-    <w:p>
-      <w:pPr>
-        <w:pStyle w:val="ListBullet"/>
-      </w:pPr>
-      <w:r>
-        <w:t>The marketplace is client-rendered; listing pages must be inspected in a real browser, not with a static HTML extractor.</w:t>
-      </w:r>
-    </w:p>
-    <w:p/>
-    <w:p>
-      <w:pPr>
-        <w:pStyle w:val="Heading2"/>
-      </w:pPr>
-      <w:r>
-        <w:t>5.2 Successful listing-filter validation</w:t>
-      </w:r>
-    </w:p>
-    <w:p/>
-    <w:p>
-      <w:r>
-        <w:t>A collection listing result is complete only when all conditions hold:</w:t>
-      </w:r>
-    </w:p>
-    <w:p/>
-    <w:p>
-      <w:pPr>
-        <w:pStyle w:val="ListNumber"/>
-      </w:pPr>
-      <w:r>
-        <w:t>The rendered browser URL retains the stored buy-now and Exotic query parameters.</w:t>
-      </w:r>
-    </w:p>
-    <w:p>
-      <w:pPr>
-        <w:pStyle w:val="ListNumber"/>
-      </w:pPr>
-      <w:r>
-        <w:t>The listed-only/buy-now control is visibly active.</w:t>
-      </w:r>
-    </w:p>
-    <w:p>
-      <w:pPr>
-        <w:pStyle w:val="ListNumber"/>
-      </w:pPr>
-      <w:r>
-        <w:t>The Rarity control shows one active selection. The marketplace commonly renders this collapsed state as `Rarity 1`; combined with the exact stored Exotic URL, this is valid Exotic-filter evidence.</w:t>
-      </w:r>
-    </w:p>
-    <w:p>
-      <w:pPr>
-        <w:pStyle w:val="ListNumber"/>
-      </w:pPr>
-      <w:r>
-        <w:t>Rendered cards are available to inspect, or the confirmed filtered view contains no cards (a valid zero-listing result).</w:t>
-      </w:r>
-    </w:p>
-    <w:p/>
-    <w:p>
-      <w:pPr>
-        <w:pStyle w:val="Heading2"/>
-      </w:pPr>
-      <w:r>
-        <w:t>5.3 Listing normalization</w:t>
-      </w:r>
-    </w:p>
-    <w:p/>
-    <w:p>
-      <w:r>
-        <w:t>For each complete collection result, store a deterministic sorted listing list containing:</w:t>
-      </w:r>
-    </w:p>
-    <w:p/>
-    <w:p>
-      <w:pPr>
-        <w:pStyle w:val="ListBullet"/>
-      </w:pPr>
-      <w:r>
-        <w:t>token ID (internal);</w:t>
-      </w:r>
-    </w:p>
-    <w:p>
-      <w:pPr>
-        <w:pStyle w:val="ListBullet"/>
-      </w:pPr>
-      <w:r>
-        <w:t>item name (internal);</w:t>
-      </w:r>
-    </w:p>
-    <w:p>
-      <w:pPr>
-        <w:pStyle w:val="ListBullet"/>
-      </w:pPr>
-      <w:r>
-        <w:t>price;</w:t>
-      </w:r>
-    </w:p>
-    <w:p>
-      <w:pPr>
-        <w:pStyle w:val="ListBullet"/>
-      </w:pPr>
-      <w:r>
-        <w:t>currency (`POLYGON`);</w:t>
-      </w:r>
-    </w:p>
-    <w:p>
-      <w:pPr>
-        <w:pStyle w:val="ListBullet"/>
-      </w:pPr>
-      <w:r>
-        <w:t>token URL (internal);</w:t>
-      </w:r>
-    </w:p>
-    <w:p>
-      <w:pPr>
-        <w:pStyle w:val="ListBullet"/>
-      </w:pPr>
-      <w:r>
-        <w:t>`for_sale` boolean;</w:t>
-      </w:r>
-    </w:p>
-    <w:p>
-      <w:pPr>
-        <w:pStyle w:val="ListBullet"/>
-      </w:pPr>
-      <w:r>
-        <w:t>`listing_count`.</w:t>
-      </w:r>
-    </w:p>
-    <w:p/>
-    <w:p>
-      <w:r>
-        <w:t>A tracked change is any change to availability, count, token identity, token name, price, currency, or verified last-Exotic-sale data.</w:t>
-      </w:r>
-    </w:p>
-    <w:p/>
-    <w:p>
-      <w:pPr>
-        <w:pStyle w:val="Heading1"/>
-      </w:pPr>
-      <w:r>
-        <w:t>6. Marketplace request sequencing and anti-bot protection</w:t>
-      </w:r>
-    </w:p>
-    <w:p/>
-    <w:p>
-      <w:pPr>
-        <w:pStyle w:val="Heading2"/>
-      </w:pPr>
-      <w:r>
-        <w:t>6.1 Mandatory serial flow</w:t>
-      </w:r>
-    </w:p>
-    <w:p/>
-    <w:p>
-      <w:pPr>
-        <w:pStyle w:val="ListNumber"/>
-      </w:pPr>
-      <w:r>
-        <w:t>Start with one collection source URL in one real browser tab/session.</w:t>
-      </w:r>
-    </w:p>
-    <w:p>
-      <w:pPr>
-        <w:pStyle w:val="ListNumber"/>
-      </w:pPr>
-      <w:r>
-        <w:t>Wait for the page to render and validate the filters.</w:t>
-      </w:r>
-    </w:p>
-    <w:p>
-      <w:pPr>
-        <w:pStyle w:val="ListNumber"/>
-      </w:pPr>
-      <w:r>
-        <w:t>Capture and normalize the listing result, or classify that collection attempt as a local failure.</w:t>
-      </w:r>
-    </w:p>
-    <w:p>
-      <w:pPr>
-        <w:pStyle w:val="ListNumber"/>
-      </w:pPr>
-      <w:r>
-        <w:t>Wait **at least 15 seconds** after every marketplace navigation/request.</w:t>
-      </w:r>
-    </w:p>
-    <w:p>
-      <w:pPr>
-        <w:pStyle w:val="ListNumber"/>
-      </w:pPr>
-      <w:r>
-        <w:t>Only after that cooldown, navigate to the next collection or retry the same collection.</w:t>
-      </w:r>
-    </w:p>
-    <w:p>
-      <w:pPr>
-        <w:pStyle w:val="ListNumber"/>
-      </w:pPr>
-      <w:r>
-        <w:t>Never batch collection URLs, open parallel marketplace tabs, or rely on tool latency as the cooldown.</w:t>
-      </w:r>
-    </w:p>
-    <w:p/>
-    <w:p>
-      <w:r>
-        <w:t>The 15-second interval exceeds the required 10-second minimum.</w:t>
-      </w:r>
-    </w:p>
-    <w:p/>
-    <w:p>
-      <w:pPr>
-        <w:pStyle w:val="Heading2"/>
-      </w:pPr>
-      <w:r>
-        <w:t>6.2 Global protection response</w:t>
-      </w:r>
-    </w:p>
-    <w:p/>
-    <w:p>
-      <w:r>
-        <w:t>If the marketplace presents a site-wide 429, CAPTCHA/challenge, or explicit access-denied/block page:</w:t>
-      </w:r>
-    </w:p>
-    <w:p/>
-    <w:p>
-      <w:pPr>
-        <w:pStyle w:val="ListNumber"/>
-      </w:pPr>
-      <w:r>
-        <w:t>Stop all remaining marketplace requests immediately.</w:t>
-      </w:r>
-    </w:p>
-    <w:p>
-      <w:pPr>
-        <w:pStyle w:val="ListNumber"/>
-      </w:pPr>
-      <w:r>
-        <w:t>Do not retry rapidly.</w:t>
-      </w:r>
-    </w:p>
-    <w:p>
-      <w:pPr>
-        <w:pStyle w:val="ListNumber"/>
-      </w:pPr>
-      <w:r>
-        <w:t>Retain all prior verified state.</w:t>
-      </w:r>
-    </w:p>
-    <w:p>
-      <w:pPr>
-        <w:pStyle w:val="ListNumber"/>
-      </w:pPr>
-      <w:r>
-        <w:t>Mark the run as a global partial/block condition in Discord.</w:t>
-      </w:r>
-    </w:p>
-    <w:p>
-      <w:pPr>
-        <w:pStyle w:val="ListNumber"/>
-      </w:pPr>
-      <w:r>
-        <w:t>Do not create a WhatsApp change event.</w:t>
-      </w:r>
-    </w:p>
-    <w:p/>
-    <w:p>
-      <w:r>
-        <w:t>An unexpected redirect—including a redirect to the generic `rarible.org/` API/marketing page—is **not** sufficient evidence of a bot block. Treat it as a local collection failure, retry that collection within the serial limit, retain its prior row if needed, and continue with remaining collections.</w:t>
-      </w:r>
-    </w:p>
-    <w:p/>
-    <w:p>
-      <w:pPr>
-        <w:pStyle w:val="Heading1"/>
-      </w:pPr>
-      <w:r>
-        <w:t>7. Per-collection fault isolation</w:t>
-      </w:r>
-    </w:p>
-    <w:p/>
-    <w:p>
-      <w:r>
-        <w:t>A loading shell, timeout, extraction/navigation error, partial render, unexpected redirect, filter ambiguity, or collection-specific 5xx is a **local** failure.</w:t>
-      </w:r>
-    </w:p>
-    <w:p/>
-    <w:p>
-      <w:r>
-        <w:t>For each local failure:</w:t>
-      </w:r>
-    </w:p>
-    <w:p/>
-    <w:p>
-      <w:pPr>
-        <w:pStyle w:val="ListNumber"/>
-      </w:pPr>
-      <w:r>
-        <w:t>Retry only that collection, up to three total attempts.</w:t>
-      </w:r>
-    </w:p>
-    <w:p>
-      <w:pPr>
-        <w:pStyle w:val="ListNumber"/>
-      </w:pPr>
-      <w:r>
-        <w:t>Apply the 15-second serial cooldown after each attempt.</w:t>
-      </w:r>
-    </w:p>
-    <w:p>
-      <w:pPr>
-        <w:pStyle w:val="ListNumber"/>
-      </w:pPr>
-      <w:r>
-        <w:t>On final failure, save only an internal failure timestamp/diagnostic.</w:t>
-      </w:r>
-    </w:p>
-    <w:p>
-      <w:pPr>
-        <w:pStyle w:val="ListNumber"/>
-      </w:pPr>
-      <w:r>
-        <w:t>Preserve that collection's prior baseline, last successful observation timestamp, and last verified Exotic sale.</w:t>
-      </w:r>
-    </w:p>
-    <w:p>
-      <w:pPr>
-        <w:pStyle w:val="ListNumber"/>
-      </w:pPr>
-      <w:r>
-        <w:t>Continue with all remaining collections.</w:t>
-      </w:r>
-    </w:p>
-    <w:p/>
-    <w:p>
-      <w:r>
-        <w:t>A failed collection must never stop successful observations for other collections and must never be replaced with zero listings or blank data.</w:t>
-      </w:r>
-    </w:p>
-    <w:p/>
-    <w:p>
-      <w:pPr>
-        <w:pStyle w:val="Heading1"/>
-      </w:pPr>
-      <w:r>
-        <w:t>8. Last Exotic sale logic</w:t>
-      </w:r>
-    </w:p>
-    <w:p/>
-    <w:p>
-      <w:pPr>
-        <w:pStyle w:val="Heading2"/>
-      </w:pPr>
-      <w:r>
-        <w:t>8.1 Authority and verification</w:t>
-      </w:r>
-    </w:p>
-    <w:p/>
-    <w:p>
-      <w:pPr>
-        <w:pStyle w:val="ListNumber"/>
-      </w:pPr>
-      <w:r>
-        <w:t>Use the collection-level **Activity** view as the authoritative source for sale price and displayed activity time.</w:t>
-      </w:r>
-    </w:p>
-    <w:p>
-      <w:pPr>
-        <w:pStyle w:val="ListNumber"/>
-      </w:pPr>
-      <w:r>
-        <w:t>Inspect Sale rows newest-first.</w:t>
-      </w:r>
-    </w:p>
-    <w:p>
-      <w:pPr>
-        <w:pStyle w:val="ListNumber"/>
-      </w:pPr>
-      <w:r>
-        <w:t>A yellow lower-left thumbnail marker, or an asset path containing `/exotic/`, is definitive positive evidence that a candidate is Exotic and should be prioritized.</w:t>
-      </w:r>
-    </w:p>
-    <w:p>
-      <w:pPr>
-        <w:pStyle w:val="ListNumber"/>
-      </w:pPr>
-      <w:r>
-        <w:t>Absence of that marker is not negative evidence; unmarked candidates remain eligible for verification.</w:t>
-      </w:r>
-    </w:p>
-    <w:p>
-      <w:pPr>
-        <w:pStyle w:val="ListNumber"/>
-      </w:pPr>
-      <w:r>
-        <w:t>Open the candidate product page only to verify its `Rarity = Exotic` trait.</w:t>
-      </w:r>
-    </w:p>
-    <w:p>
-      <w:pPr>
-        <w:pStyle w:val="ListNumber"/>
-      </w:pPr>
-      <w:r>
-        <w:t>On confirmation, record the Activity row's displayed price, currency, and displayed time exactly as shown.</w:t>
-      </w:r>
-    </w:p>
-    <w:p>
-      <w:pPr>
-        <w:pStyle w:val="ListNumber"/>
-      </w:pPr>
-      <w:r>
-        <w:t>Stop reviewing older Activity rows after the first newest verified Exotic sale.</w:t>
-      </w:r>
-    </w:p>
-    <w:p/>
-    <w:p>
-      <w:pPr>
-        <w:pStyle w:val="Heading2"/>
-      </w:pPr>
-      <w:r>
-        <w:t>8.2 Incremental Activity review</w:t>
-      </w:r>
-    </w:p>
-    <w:p/>
-    <w:p>
-      <w:pPr>
-        <w:pStyle w:val="ListNumber"/>
-      </w:pPr>
-      <w:r>
-        <w:t>Persist an internal fingerprint for the newest Activity Sale of any rarity: token ID, displayed price, and displayed time.</w:t>
-      </w:r>
-    </w:p>
-    <w:p>
-      <w:pPr>
-        <w:pStyle w:val="ListNumber"/>
-      </w:pPr>
-      <w:r>
-        <w:t>On a complete later Activity check, compare the newest fingerprint with the stored fingerprint.</w:t>
-      </w:r>
-    </w:p>
-    <w:p>
-      <w:pPr>
-        <w:pStyle w:val="ListNumber"/>
-      </w:pPr>
-      <w:r>
-        <w:t>If unchanged, retain the existing verified last-Exotic sale and do not inspect older Activity rows or token pages.</w:t>
-      </w:r>
-    </w:p>
-    <w:p>
-      <w:pPr>
-        <w:pStyle w:val="ListNumber"/>
-      </w:pPr>
-      <w:r>
-        <w:t>If changed or absent, perform the newest-first review above.</w:t>
-      </w:r>
-    </w:p>
-    <w:p>
-      <w:pPr>
-        <w:pStyle w:val="ListNumber"/>
-      </w:pPr>
-      <w:r>
-        <w:t>The any-rarity fingerprint is internal and never appears in tables or notifications.</w:t>
-      </w:r>
-    </w:p>
-    <w:p/>
-    <w:p>
-      <w:pPr>
-        <w:pStyle w:val="Heading2"/>
-      </w:pPr>
-      <w:r>
-        <w:t>8.3 Product History restriction</w:t>
-      </w:r>
-    </w:p>
-    <w:p/>
-    <w:p>
-      <w:r>
-        <w:t>Product-page History can optionally double-check the already identified token. It must never establish the collection-level last Exotic sale; the collection Activity view remains authoritative.</w:t>
-      </w:r>
-    </w:p>
-    <w:p/>
-    <w:p>
-      <w:pPr>
-        <w:pStyle w:val="Heading1"/>
-      </w:pPr>
-      <w:r>
-        <w:t>9. Data persistence and rendering</w:t>
-      </w:r>
-    </w:p>
-    <w:p/>
-    <w:p>
-      <w:pPr>
-        <w:pStyle w:val="Heading2"/>
-      </w:pPr>
-      <w:r>
-        <w:t>9.1 Machine-readable state</w:t>
-      </w:r>
-    </w:p>
-    <w:p/>
-    <w:p>
-      <w:r>
-        <w:t>The JSON state stores collection membership, source URLs, last-known-good normalized listings, per-row successful timestamps, internal token/item evidence, last Exotic sale evidence, latest Activity fingerprints, failure policy, delivery policy, and WhatsApp change-event deduplication.</w:t>
-      </w:r>
-    </w:p>
-    <w:p/>
-    <w:p>
-      <w:pPr>
-        <w:pStyle w:val="Heading2"/>
-      </w:pPr>
-      <w:r>
-        <w:t>9.2 User-facing display policy</w:t>
-      </w:r>
-    </w:p>
-    <w:p/>
-    <w:p>
-      <w:r>
-        <w:t>User-facing status must show only:</w:t>
-      </w:r>
-    </w:p>
-    <w:p/>
-    <w:p>
-      <w:pPr>
-        <w:pStyle w:val="ListBullet"/>
-      </w:pPr>
-      <w:r>
-        <w:t>collection name;</w:t>
-      </w:r>
-    </w:p>
-    <w:p>
-      <w:pPr>
-        <w:pStyle w:val="ListBullet"/>
-      </w:pPr>
-      <w:r>
-        <w:t>whether an Exotic listing is currently for sale;</w:t>
-      </w:r>
-    </w:p>
-    <w:p>
-      <w:pPr>
-        <w:pStyle w:val="ListBullet"/>
-      </w:pPr>
-      <w:r>
-        <w:t>listing count;</w:t>
-      </w:r>
-    </w:p>
-    <w:p>
-      <w:pPr>
-        <w:pStyle w:val="ListBullet"/>
-      </w:pPr>
-      <w:r>
-        <w:t>price(s) in `POL` (the internal/state currency remains `POLYGON`);</w:t>
-      </w:r>
-    </w:p>
-    <w:p>
-      <w:pPr>
-        <w:pStyle w:val="ListBullet"/>
-      </w:pPr>
-      <w:r>
-        <w:t>last successful update time;</w:t>
-      </w:r>
-    </w:p>
-    <w:p>
-      <w:pPr>
-        <w:pStyle w:val="ListBullet"/>
-      </w:pPr>
-      <w:r>
-        <w:t>`last` price/time;</w:t>
-      </w:r>
-    </w:p>
-    <w:p>
-      <w:pPr>
-        <w:pStyle w:val="ListBullet"/>
-      </w:pPr>
-      <w:r>
-        <w:t>Discord View link only when a collection is currently for sale.</w:t>
-      </w:r>
-    </w:p>
-    <w:p/>
-    <w:p>
-      <w:r>
-        <w:t>User-facing status must not show NFT item names, token IDs, token URLs, contract IDs, or raw source URLs.</w:t>
-      </w:r>
-    </w:p>
-    <w:p/>
-    <w:p>
-      <w:pPr>
-        <w:pStyle w:val="Heading2"/>
-      </w:pPr>
-      <w:r>
-        <w:t>9.3 Files</w:t>
-      </w:r>
-    </w:p>
-    <w:p/>
-    <w:p>
-      <w:pPr>
-        <w:pStyle w:val="ListBullet"/>
-      </w:pPr>
-      <w:r>
-        <w:t>State: `C:/Users/jltfo/AppData/Local/hermes/price-watches/mcfarlane-exotics.json`</w:t>
-      </w:r>
-    </w:p>
-    <w:p>
-      <w:pPr>
-        <w:pStyle w:val="ListBullet"/>
-      </w:pPr>
-      <w:r>
-        <w:t>Local review table: `C:/Users/jltfo/nft_exotic_watch.md`</w:t>
-      </w:r>
-    </w:p>
-    <w:p>
-      <w:pPr>
-        <w:pStyle w:val="ListBullet"/>
-      </w:pPr>
-      <w:r>
-        <w:t>Discord rendering helper/output: `render_mcfarlane_discord_status.py` / `mcfarlane-discord-status.md`</w:t>
-      </w:r>
-    </w:p>
-    <w:p>
-      <w:pPr>
-        <w:pStyle w:val="ListBullet"/>
-      </w:pPr>
-      <w:r>
-        <w:t>WhatsApp rendering helper/output: `render_mcfarlane_whatsapp_status.py` / `mcfarlane-whatsapp-status.md`</w:t>
-      </w:r>
-    </w:p>
-    <w:p>
-      <w:pPr>
-        <w:pStyle w:val="ListBullet"/>
-      </w:pPr>
-      <w:r>
-        <w:t>This PRD: `C:/Users/jltfo/Documents/McFarlane_Exotic_Watch_PRD.md`</w:t>
-      </w:r>
-    </w:p>
-    <w:p/>
-    <w:p>
-      <w:r>
-        <w:t>All rendered status rows use CRLF physical line endings.</w:t>
-      </w:r>
-    </w:p>
-    <w:p/>
-    <w:p>
-      <w:pPr>
-        <w:pStyle w:val="Heading1"/>
-      </w:pPr>
-      <w:r>
-        <w:t>10. Notification requirements</w:t>
-      </w:r>
-    </w:p>
-    <w:p/>
-    <w:p>
-      <w:pPr>
-        <w:pStyle w:val="Heading2"/>
-      </w:pPr>
-      <w:r>
-        <w:t>10.1 Discord</w:t>
-      </w:r>
-    </w:p>
-    <w:p/>
-    <w:p>
-      <w:pPr>
-        <w:pStyle w:val="ListBullet"/>
-      </w:pPr>
-      <w:r>
-        <w:t>Send an update after every scheduled run: changed, no-change, partial, or global-block status.</w:t>
-      </w:r>
-    </w:p>
-    <w:p>
-      <w:pPr>
-        <w:pStyle w:val="ListBullet"/>
-      </w:pPr>
-      <w:r>
-        <w:t>Use a compact native bullet list with one collection per line.</w:t>
-      </w:r>
-    </w:p>
-    <w:p>
-      <w:pPr>
-        <w:pStyle w:val="ListBullet"/>
-      </w:pPr>
-      <w:r>
-        <w:t>**No-change output:** deliver the active-only status list. It includes only collections with a currently active Exotic buy-now listing and omits all inactive collections. If none are active, say `No active Exotic buy-now listings.`</w:t>
-      </w:r>
-    </w:p>
-    <w:p>
-      <w:pPr>
-        <w:pStyle w:val="ListBullet"/>
-      </w:pPr>
-      <w:r>
-        <w:t>**Changed output:** deliver the full status list for every monitored collection, including inactive rows, so the user can review the complete change context.</w:t>
-      </w:r>
-    </w:p>
-    <w:p>
-      <w:pPr>
-        <w:pStyle w:val="ListBullet"/>
-      </w:pPr>
-      <w:r>
-        <w:t>**Partial output:** begin `Partial check —`, name failures and confirm their prior values were retained. Use active-only output if there are no verified changes; use full output if a verified change exists.</w:t>
-      </w:r>
-    </w:p>
-    <w:p>
-      <w:pPr>
-        <w:pStyle w:val="ListBullet"/>
-      </w:pPr>
-      <w:r>
-        <w:t>Active collections must display **🟢 YES** and **🟢 price** in bold. Discord ordinary messages do not support arbitrary text color; the green marker is the visual color cue.</w:t>
-      </w:r>
-    </w:p>
-    <w:p>
-      <w:pPr>
-        <w:pStyle w:val="ListBullet"/>
-      </w:pPr>
-      <w:r>
-        <w:t>For active collections, use a masked no-embed link exactly like `[View](&lt;https://...&gt;)`. This is clickable, hides the full URL, and suppresses Discord's large marketplace preview card.</w:t>
-      </w:r>
-    </w:p>
-    <w:p>
-      <w:pPr>
-        <w:pStyle w:val="ListBullet"/>
-      </w:pPr>
-      <w:r>
-        <w:t>Changed response begins: `Changes detected —`.</w:t>
-      </w:r>
-    </w:p>
-    <w:p/>
-    <w:p>
-      <w:pPr>
-        <w:pStyle w:val="Heading2"/>
-      </w:pPr>
-      <w:r>
-        <w:t>10.2 WhatsApp</w:t>
-      </w:r>
-    </w:p>
-    <w:p/>
-    <w:p>
-      <w:pPr>
-        <w:pStyle w:val="ListBullet"/>
-      </w:pPr>
-      <w:r>
-        <w:t>Send only for verified changes, using a downstream changes-only job and a deterministic pending-change fingerprint.</w:t>
-      </w:r>
-    </w:p>
-    <w:p>
-      <w:pPr>
-        <w:pStyle w:val="ListBullet"/>
-      </w:pPr>
-      <w:r>
-        <w:t>For no pending change, output exactly `[SILENT]` so no WhatsApp message is delivered.</w:t>
-      </w:r>
-    </w:p>
-    <w:p>
-      <w:pPr>
-        <w:pStyle w:val="ListBullet"/>
-      </w:pPr>
-      <w:r>
-        <w:t>Never send URLs or View links; WhatsApp renders URLs in full and degrades readability.</w:t>
-      </w:r>
-    </w:p>
-    <w:p>
-      <w:pPr>
-        <w:pStyle w:val="ListBullet"/>
-      </w:pPr>
-      <w:r>
-        <w:t>Active collections must display `*🟢 YES*` and `*🟢 &lt;price&gt; POLYGON*`.</w:t>
-      </w:r>
-    </w:p>
-    <w:p>
-      <w:pPr>
-        <w:pStyle w:val="ListBullet"/>
-      </w:pPr>
-      <w:r>
-        <w:t>WhatsApp supports bold formatting but not arbitrary text colors; the green marker provides the visual highlight.</w:t>
-      </w:r>
-    </w:p>
-    <w:p>
-      <w:pPr>
-        <w:pStyle w:val="ListBullet"/>
-      </w:pPr>
-      <w:r>
-        <w:t>No-change and failure-only runs create no WhatsApp notification.</w:t>
-      </w:r>
-    </w:p>
-    <w:p/>
-    <w:p>
-      <w:pPr>
-        <w:pStyle w:val="Heading1"/>
-      </w:pPr>
-      <w:r>
-        <w:t>11. Scheduled jobs</w:t>
-      </w:r>
-    </w:p>
-    <w:p/>
-    <w:p>
-      <w:r>
-        <w:t>| Job | Schedule | Destination | Purpose |</w:t>
+        <w:t>Backup and review</w:t>
       </w:r>
     </w:p>
     <w:p>
       <w:r>
-        <w:t>|---|---|---|---|</w:t>
-      </w:r>
-    </w:p>
-    <w:p>
-      <w:r>
-        <w:t>| McFarlane Exotic NFT Watch | 00:00, 08:00, 12:00, 16:00, 20:00 EDT | Discord | Main browser-based monitor and every-run report |</w:t>
-      </w:r>
-    </w:p>
-    <w:p>
-      <w:r>
-        <w:t>| McFarlane Exotic Watch — WhatsApp changes only | 15 minutes after each main schedule | WhatsApp | Deduplicated delivery of verified changes only |</w:t>
-      </w:r>
-    </w:p>
-    <w:p/>
-    <w:p>
-      <w:pPr>
-        <w:pStyle w:val="Heading1"/>
-      </w:pPr>
-      <w:r>
-        <w:t>12. End-to-end run sequence</w:t>
-      </w:r>
-    </w:p>
-    <w:p/>
-    <w:p>
-      <w:pPr>
-        <w:pStyle w:val="ListNumber"/>
-      </w:pPr>
-      <w:r>
-        <w:t>Scheduler starts the Discord monitor at a configured Eastern-time interval.</w:t>
-      </w:r>
-    </w:p>
-    <w:p>
-      <w:pPr>
-        <w:pStyle w:val="ListNumber"/>
-      </w:pPr>
-      <w:r>
-        <w:t>Monitor loads the JSON state and its exact stored collection URLs.</w:t>
-      </w:r>
-    </w:p>
-    <w:p>
-      <w:pPr>
-        <w:pStyle w:val="ListNumber"/>
-      </w:pPr>
-      <w:r>
-        <w:t>Monitor visits collection pages one at a time in one browser tab.</w:t>
-      </w:r>
-    </w:p>
-    <w:p>
-      <w:pPr>
-        <w:pStyle w:val="ListNumber"/>
-      </w:pPr>
-      <w:r>
-        <w:t>Monitor validates filters, parses cards, and waits 15 seconds before each next marketplace request.</w:t>
-      </w:r>
-    </w:p>
-    <w:p>
-      <w:pPr>
-        <w:pStyle w:val="ListNumber"/>
-      </w:pPr>
-      <w:r>
-        <w:t>Each complete collection result updates only that collection's candidate state.</w:t>
-      </w:r>
-    </w:p>
-    <w:p>
-      <w:pPr>
-        <w:pStyle w:val="ListNumber"/>
-      </w:pPr>
-      <w:r>
-        <w:t>Each failed collection preserves prior values and allows the run to continue.</w:t>
-      </w:r>
-    </w:p>
-    <w:p>
-      <w:pPr>
-        <w:pStyle w:val="ListNumber"/>
-      </w:pPr>
-      <w:r>
-        <w:t>Monitor compares complete observations against prior baselines.</w:t>
-      </w:r>
-    </w:p>
-    <w:p>
-      <w:pPr>
-        <w:pStyle w:val="ListNumber"/>
-      </w:pPr>
-      <w:r>
-        <w:t>Monitor updates verified baselines and per-row timestamps only for successful collections.</w:t>
-      </w:r>
-    </w:p>
-    <w:p>
-      <w:pPr>
-        <w:pStyle w:val="ListNumber"/>
-      </w:pPr>
-      <w:r>
-        <w:t>Monitor reviews Activity only when needed by the newest-sale fingerprint rule.</w:t>
-      </w:r>
-    </w:p>
-    <w:p>
-      <w:pPr>
-        <w:pStyle w:val="ListNumber"/>
-      </w:pPr>
-      <w:r>
-        <w:t>Monitor writes internal state and regenerates local, Discord, and WhatsApp renderings.</w:t>
-      </w:r>
-    </w:p>
-    <w:p>
-      <w:pPr>
-        <w:pStyle w:val="ListNumber"/>
-      </w:pPr>
-      <w:r>
-        <w:t>Monitor selects the Discord rendering based on result: on a verified change, send the complete all-collection list; on a no-change run, send only currently active Exotic buy-now rows; on a partial run, use active-only unless a verified change requires the full list.</w:t>
-      </w:r>
-    </w:p>
-    <w:p>
-      <w:pPr>
-        <w:pStyle w:val="ListNumber"/>
-      </w:pPr>
-      <w:r>
-        <w:t>If verified tracked data changed, monitor writes a pending WhatsApp event with a deterministic fingerprint.</w:t>
-      </w:r>
-    </w:p>
-    <w:p>
-      <w:pPr>
-        <w:pStyle w:val="ListNumber"/>
-      </w:pPr>
-      <w:r>
-        <w:t>The WhatsApp delivery job reads the event 15 minutes later, delivers it once if new, records delivery acknowledgement, and remains silent otherwise.</w:t>
-      </w:r>
-    </w:p>
-    <w:p/>
-    <w:p>
-      <w:pPr>
-        <w:pStyle w:val="Heading1"/>
-      </w:pPr>
-      <w:r>
-        <w:t>13. Acceptance criteria</w:t>
-      </w:r>
-    </w:p>
-    <w:p/>
-    <w:p>
-      <w:pPr>
-        <w:pStyle w:val="ListNumber"/>
-      </w:pPr>
-      <w:r>
-        <w:t>Each scheduled run has at least 15 seconds between marketplace requests.</w:t>
-      </w:r>
-    </w:p>
-    <w:p>
-      <w:pPr>
-        <w:pStyle w:val="ListNumber"/>
-      </w:pPr>
-      <w:r>
-        <w:t>A single failed collection does not prevent the remaining collections from updating.</w:t>
-      </w:r>
-    </w:p>
-    <w:p>
-      <w:pPr>
-        <w:pStyle w:val="ListNumber"/>
-      </w:pPr>
-      <w:r>
-        <w:t>Failed rows retain last-known-good values and their last-successful timestamps.</w:t>
-      </w:r>
-    </w:p>
-    <w:p>
-      <w:pPr>
-        <w:pStyle w:val="ListNumber"/>
-      </w:pPr>
-      <w:r>
-        <w:t>Discord receives an update for every scheduled check, using active-only rows on verified no-change runs and the complete collection list when a verified update occurs.</w:t>
-      </w:r>
-    </w:p>
-    <w:p>
-      <w:pPr>
-        <w:pStyle w:val="ListNumber"/>
-      </w:pPr>
-      <w:r>
-        <w:t>WhatsApp receives no message unless a verified data change exists.</w:t>
-      </w:r>
-    </w:p>
-    <w:p>
-      <w:pPr>
-        <w:pStyle w:val="ListNumber"/>
-      </w:pPr>
-      <w:r>
-        <w:t>Active collection rows are visually prominent in both destinations.</w:t>
-      </w:r>
-    </w:p>
-    <w:p>
-      <w:pPr>
-        <w:pStyle w:val="ListNumber"/>
-      </w:pPr>
-      <w:r>
-        <w:t>Discord active rows have clickable masked View links without preview cards.</w:t>
-      </w:r>
-    </w:p>
-    <w:p>
-      <w:pPr>
-        <w:pStyle w:val="ListNumber"/>
-      </w:pPr>
-      <w:r>
-        <w:t>WhatsApp contains no View URLs.</w:t>
-      </w:r>
-    </w:p>
-    <w:p>
-      <w:pPr>
-        <w:pStyle w:val="ListNumber"/>
-      </w:pPr>
-      <w:r>
-        <w:t>Routine status contains no item name, token ID, token URL, contract ID, or raw source URL.</w:t>
-      </w:r>
-    </w:p>
-    <w:p>
-      <w:pPr>
-        <w:pStyle w:val="ListNumber"/>
-      </w:pPr>
-      <w:r>
-        <w:t>Last Exotic sales come from collection Activity, with product trait confirmation.</w:t>
-      </w:r>
-    </w:p>
-    <w:p>
-      <w:pPr>
-        <w:pStyle w:val="ListNumber"/>
-      </w:pPr>
-      <w:r>
-        <w:t>The current table and JSON state remain internally consistent.</w:t>
-      </w:r>
-    </w:p>
-    <w:p/>
-    <w:p>
-      <w:pPr>
-        <w:pStyle w:val="Heading1"/>
-      </w:pPr>
-      <w:r>
-        <w:t>14. Review and change management</w:t>
-      </w:r>
-    </w:p>
-    <w:p/>
-    <w:p>
-      <w:r>
-        <w:t>This PRD is the maintained requirements reference. Review it whenever collections, schedules, notification policy, display requirements, marketplace logic, or failure handling changes. Update the version, last-updated timestamp, affected requirements, and acceptance criteria with each material change.</w:t>
+        <w:t>The sanitized Exotic backup includes this Markdown PRD and its DOCX counterpart. Before the daily Exotic backup evaluates changes, the PRD refresh step reviews the current deterministic implementation and only rewrites the PRD when the tracked implementation signature changed. Private live state, credentials, logs, token identifiers, and source URLs are excluded from the backup.</w:t>
       </w:r>
     </w:p>
     <w:sectPr>
-      <w:footerReference w:type="default" r:id="rId9"/>
       <w:pgSz w:w="12240" w:h="15840"/>
-      <w:pgMar w:top="1080" w:right="1800" w:bottom="1080" w:left="1800" w:header="720" w:footer="720" w:gutter="0"/>
+      <w:pgMar w:top="1440" w:right="1800" w:bottom="1440" w:left="1800" w:header="720" w:footer="720" w:gutter="0"/>
       <w:cols w:space="720"/>
       <w:docGrid w:linePitch="360"/>
     </w:sectPr>
   </w:body>
 </w:document>
-</file>
-
-<file path=word/footer1.xml><?xml version="1.0" encoding="utf-8"?>
-<w:ftr xmlns:m="http://schemas.openxmlformats.org/officeDocument/2006/math" xmlns:mc="http://schemas.openxmlformats.org/markup-compatibility/2006" xmlns:mo="http://schemas.microsoft.com/office/mac/office/2008/main" xmlns:mv="urn:schemas-microsoft-com:mac:vml" xmlns:o="urn:schemas-microsoft-com:office:office" xmlns:r="http://schemas.openxmlformats.org/officeDocument/2006/relationships" xmlns:v="urn:schemas-microsoft-com:vml" xmlns:w10="urn:schemas-microsoft-com:office:word" xmlns:w14="http://schemas.microsoft.com/office/word/2010/wordml" xmlns:w="http://schemas.openxmlformats.org/wordprocessingml/2006/main" xmlns:wne="http://schemas.microsoft.com/office/word/2006/wordml" xmlns:wp14="http://schemas.microsoft.com/office/word/2010/wordprocessingDrawing" xmlns:wp="http://schemas.openxmlformats.org/drawingml/2006/wordprocessingDrawing" xmlns:wpc="http://schemas.microsoft.com/office/word/2010/wordprocessingCanvas" xmlns:wpg="http://schemas.microsoft.com/office/word/2010/wordprocessingGroup" xmlns:wpi="http://schemas.microsoft.com/office/word/2010/wordprocessingInk" xmlns:wps="http://schemas.microsoft.com/office/word/2010/wordprocessingShape" mc:Ignorable="w14 wp14">
-  <w:p>
-    <w:pPr>
-      <w:pStyle w:val="Footer"/>
-    </w:pPr>
-    <w:r>
-      <w:t>McFarlane Exotic Watch PRD — maintained requirements reference</w:t>
-    </w:r>
-  </w:p>
-</w:ftr>
 </file>
 
 <file path=word/numbering.xml><?xml version="1.0" encoding="utf-8"?>
@@ -1735,6 +748,10 @@
     <w:name w:val="Normal"/>
     <w:qFormat/>
     <w:rsid w:val="00FC693F"/>
+    <w:rPr>
+      <w:rFonts w:ascii="Aptos" w:hAnsi="Aptos"/>
+      <w:sz w:val="21"/>
+    </w:rPr>
   </w:style>
   <w:style w:type="paragraph" w:styleId="Header">
     <w:name w:val="header"/>

</xml_diff>

<commit_message>
backup: Exotic monitor 2026-09-02
</commit_message>
<xml_diff>
--- a/McFarlane_Exotic_Watch_PRD.docx
+++ b/McFarlane_Exotic_Watch_PRD.docx
@@ -17,12 +17,12 @@
     </w:p>
     <w:p>
       <w:r>
-        <w:t xml:space="preserve">Last updated: 2026-09-01 EDT  </w:t>
+        <w:t xml:space="preserve">Last updated: 2026-09-02 EDT  </w:t>
       </w:r>
     </w:p>
     <w:p>
       <w:r>
-        <w:t xml:space="preserve">Implementation signature: `8baf19b07a9a`  </w:t>
+        <w:t xml:space="preserve">Implementation signature: `b516a517bc7e`  </w:t>
       </w:r>
     </w:p>
     <w:p>

</xml_diff>

<commit_message>
backup: Exotic monitor 2026-09-03
</commit_message>
<xml_diff>
--- a/McFarlane_Exotic_Watch_PRD.docx
+++ b/McFarlane_Exotic_Watch_PRD.docx
@@ -17,12 +17,12 @@
     </w:p>
     <w:p>
       <w:r>
-        <w:t xml:space="preserve">Last updated: 2026-09-02 EDT  </w:t>
+        <w:t xml:space="preserve">Last updated: 2026-09-03 EDT  </w:t>
       </w:r>
     </w:p>
     <w:p>
       <w:r>
-        <w:t xml:space="preserve">Implementation signature: `b516a517bc7e`  </w:t>
+        <w:t xml:space="preserve">Implementation signature: `a9de8c0e576a`  </w:t>
       </w:r>
     </w:p>
     <w:p>

</xml_diff>

<commit_message>
backup: Exotic monitor 2026-09-04
</commit_message>
<xml_diff>
--- a/McFarlane_Exotic_Watch_PRD.docx
+++ b/McFarlane_Exotic_Watch_PRD.docx
@@ -17,12 +17,12 @@
     </w:p>
     <w:p>
       <w:r>
-        <w:t xml:space="preserve">Last updated: 2026-09-03 EDT  </w:t>
+        <w:t xml:space="preserve">Last updated: 2026-09-04 EDT  </w:t>
       </w:r>
     </w:p>
     <w:p>
       <w:r>
-        <w:t xml:space="preserve">Implementation signature: `a9de8c0e576a`  </w:t>
+        <w:t xml:space="preserve">Implementation signature: `56024186e266`  </w:t>
       </w:r>
     </w:p>
     <w:p>

</xml_diff>

<commit_message>
backup: Exotic monitor 2026-09-05
</commit_message>
<xml_diff>
--- a/McFarlane_Exotic_Watch_PRD.docx
+++ b/McFarlane_Exotic_Watch_PRD.docx
@@ -17,12 +17,12 @@
     </w:p>
     <w:p>
       <w:r>
-        <w:t xml:space="preserve">Last updated: 2026-09-04 EDT  </w:t>
+        <w:t xml:space="preserve">Last updated: 2026-09-05 EDT  </w:t>
       </w:r>
     </w:p>
     <w:p>
       <w:r>
-        <w:t xml:space="preserve">Implementation signature: `56024186e266`  </w:t>
+        <w:t xml:space="preserve">Implementation signature: `3487f778a265`  </w:t>
       </w:r>
     </w:p>
     <w:p>

</xml_diff>

<commit_message>
backup: Exotic monitor 2026-09-06
</commit_message>
<xml_diff>
--- a/McFarlane_Exotic_Watch_PRD.docx
+++ b/McFarlane_Exotic_Watch_PRD.docx
@@ -17,12 +17,12 @@
     </w:p>
     <w:p>
       <w:r>
-        <w:t xml:space="preserve">Last updated: 2026-09-05 EDT  </w:t>
+        <w:t xml:space="preserve">Last updated: 2026-09-06 EDT  </w:t>
       </w:r>
     </w:p>
     <w:p>
       <w:r>
-        <w:t xml:space="preserve">Implementation signature: `3487f778a265`  </w:t>
+        <w:t xml:space="preserve">Implementation signature: `e2a25b06a233`  </w:t>
       </w:r>
     </w:p>
     <w:p>

</xml_diff>

<commit_message>
backup: Exotic monitor 2026-09-07
</commit_message>
<xml_diff>
--- a/McFarlane_Exotic_Watch_PRD.docx
+++ b/McFarlane_Exotic_Watch_PRD.docx
@@ -17,12 +17,12 @@
     </w:p>
     <w:p>
       <w:r>
-        <w:t xml:space="preserve">Last updated: 2026-09-06 EDT  </w:t>
+        <w:t xml:space="preserve">Last updated: 2026-09-07 EDT  </w:t>
       </w:r>
     </w:p>
     <w:p>
       <w:r>
-        <w:t xml:space="preserve">Implementation signature: `e2a25b06a233`  </w:t>
+        <w:t xml:space="preserve">Implementation signature: `ceeae8933a47`  </w:t>
       </w:r>
     </w:p>
     <w:p>

</xml_diff>

<commit_message>
backup: Exotic monitor 2026-09-08
</commit_message>
<xml_diff>
--- a/McFarlane_Exotic_Watch_PRD.docx
+++ b/McFarlane_Exotic_Watch_PRD.docx
@@ -17,12 +17,12 @@
     </w:p>
     <w:p>
       <w:r>
-        <w:t xml:space="preserve">Last updated: 2026-09-07 EDT  </w:t>
+        <w:t xml:space="preserve">Last updated: 2026-09-08 EDT  </w:t>
       </w:r>
     </w:p>
     <w:p>
       <w:r>
-        <w:t xml:space="preserve">Implementation signature: `ceeae8933a47`  </w:t>
+        <w:t xml:space="preserve">Implementation signature: `1d39d262b278`  </w:t>
       </w:r>
     </w:p>
     <w:p>

</xml_diff>

<commit_message>
backup: Exotic monitor 2026-09-09
</commit_message>
<xml_diff>
--- a/McFarlane_Exotic_Watch_PRD.docx
+++ b/McFarlane_Exotic_Watch_PRD.docx
@@ -17,12 +17,12 @@
     </w:p>
     <w:p>
       <w:r>
-        <w:t xml:space="preserve">Last updated: 2026-09-08 EDT  </w:t>
+        <w:t xml:space="preserve">Last updated: 2026-09-09 EDT  </w:t>
       </w:r>
     </w:p>
     <w:p>
       <w:r>
-        <w:t xml:space="preserve">Implementation signature: `1d39d262b278`  </w:t>
+        <w:t xml:space="preserve">Implementation signature: `60a4f32bc7dc`  </w:t>
       </w:r>
     </w:p>
     <w:p>

</xml_diff>

<commit_message>
backup: Exotic monitor 2026-09-10
</commit_message>
<xml_diff>
--- a/McFarlane_Exotic_Watch_PRD.docx
+++ b/McFarlane_Exotic_Watch_PRD.docx
@@ -17,12 +17,12 @@
     </w:p>
     <w:p>
       <w:r>
-        <w:t xml:space="preserve">Last updated: 2026-09-09 EDT  </w:t>
+        <w:t xml:space="preserve">Last updated: 2026-09-10 EDT  </w:t>
       </w:r>
     </w:p>
     <w:p>
       <w:r>
-        <w:t xml:space="preserve">Implementation signature: `60a4f32bc7dc`  </w:t>
+        <w:t xml:space="preserve">Implementation signature: `2761215de173`  </w:t>
       </w:r>
     </w:p>
     <w:p>

</xml_diff>

<commit_message>
backup: Exotic monitor 2026-09-11
</commit_message>
<xml_diff>
--- a/McFarlane_Exotic_Watch_PRD.docx
+++ b/McFarlane_Exotic_Watch_PRD.docx
@@ -17,12 +17,12 @@
     </w:p>
     <w:p>
       <w:r>
-        <w:t xml:space="preserve">Last updated: 2026-09-10 EDT  </w:t>
+        <w:t xml:space="preserve">Last updated: 2026-09-11 EDT  </w:t>
       </w:r>
     </w:p>
     <w:p>
       <w:r>
-        <w:t xml:space="preserve">Implementation signature: `2761215de173`  </w:t>
+        <w:t xml:space="preserve">Implementation signature: `9c44d4c06f48`  </w:t>
       </w:r>
     </w:p>
     <w:p>

</xml_diff>

<commit_message>
backup: Exotic monitor 2026-09-12
</commit_message>
<xml_diff>
--- a/McFarlane_Exotic_Watch_PRD.docx
+++ b/McFarlane_Exotic_Watch_PRD.docx
@@ -17,12 +17,12 @@
     </w:p>
     <w:p>
       <w:r>
-        <w:t xml:space="preserve">Last updated: 2026-09-11 EDT  </w:t>
+        <w:t xml:space="preserve">Last updated: 2026-09-12 EDT  </w:t>
       </w:r>
     </w:p>
     <w:p>
       <w:r>
-        <w:t xml:space="preserve">Implementation signature: `9c44d4c06f48`  </w:t>
+        <w:t xml:space="preserve">Implementation signature: `4e63b85d6f21`  </w:t>
       </w:r>
     </w:p>
     <w:p>

</xml_diff>

<commit_message>
backup: Exotic monitor 2026-09-13
</commit_message>
<xml_diff>
--- a/McFarlane_Exotic_Watch_PRD.docx
+++ b/McFarlane_Exotic_Watch_PRD.docx
@@ -17,12 +17,12 @@
     </w:p>
     <w:p>
       <w:r>
-        <w:t xml:space="preserve">Last updated: 2026-09-12 EDT  </w:t>
+        <w:t xml:space="preserve">Last updated: 2026-09-13 EDT  </w:t>
       </w:r>
     </w:p>
     <w:p>
       <w:r>
-        <w:t xml:space="preserve">Implementation signature: `4e63b85d6f21`  </w:t>
+        <w:t xml:space="preserve">Implementation signature: `46259d735bad`  </w:t>
       </w:r>
     </w:p>
     <w:p>

</xml_diff>

<commit_message>
backup: Exotic monitor 2026-09-14
</commit_message>
<xml_diff>
--- a/McFarlane_Exotic_Watch_PRD.docx
+++ b/McFarlane_Exotic_Watch_PRD.docx
@@ -17,12 +17,12 @@
     </w:p>
     <w:p>
       <w:r>
-        <w:t xml:space="preserve">Last updated: 2026-09-13 EDT  </w:t>
+        <w:t xml:space="preserve">Last updated: 2026-09-14 EDT  </w:t>
       </w:r>
     </w:p>
     <w:p>
       <w:r>
-        <w:t xml:space="preserve">Implementation signature: `46259d735bad`  </w:t>
+        <w:t xml:space="preserve">Implementation signature: `28830fdc5fda`  </w:t>
       </w:r>
     </w:p>
     <w:p>

</xml_diff>

<commit_message>
backup: exotic source snapshot 2026-09-15
</commit_message>
<xml_diff>
--- a/McFarlane_Exotic_Watch_PRD.docx
+++ b/McFarlane_Exotic_Watch_PRD.docx
@@ -12,27 +12,22 @@
     </w:p>
     <w:p>
       <w:r>
-        <w:t xml:space="preserve">Version: 2.0  </w:t>
+        <w:t>Version: 3.0</w:t>
       </w:r>
     </w:p>
     <w:p>
       <w:r>
-        <w:t xml:space="preserve">Last updated: 2026-09-14 EDT  </w:t>
+        <w:t>Substantive implementation review: 2026-09-15; local code and recurring configuration only, no live collection or delivery test.</w:t>
       </w:r>
     </w:p>
     <w:p>
       <w:r>
-        <w:t xml:space="preserve">Implementation signature: `28830fdc5fda`  </w:t>
+        <w:t>Status: Active implementation; deployment and delivery caveats below.</w:t>
       </w:r>
     </w:p>
     <w:p>
       <w:r>
-        <w:t xml:space="preserve">Status: Active, deterministic implementation  </w:t>
-      </w:r>
-    </w:p>
-    <w:p>
-      <w:r>
-        <w:t>Private state: `C:/Users/jltfo/AppData/Local/hermes/price-watches/mcfarlane-exotics.json`</w:t>
+        <w:t>Private state: HERMES_HOME/price-watches/mcfarlane-exotics.json (not backed up).</w:t>
       </w:r>
     </w:p>
     <w:p>
@@ -40,12 +35,12 @@
         <w:pStyle w:val="Heading1"/>
       </w:pPr>
       <w:r>
-        <w:t>Purpose</w:t>
+        <w:t>Purpose and current scope</w:t>
       </w:r>
     </w:p>
     <w:p>
       <w:r>
-        <w:t>Monitor the configured McFarlane Toys Digital collections for active BUY NOW listings whose product-page trait is Rarity: Exotic. Preserve verified listings and historical Exotic-sale context, publish an every-run Discord report, and send WhatsApp only for verified listing changes.</w:t>
+        <w:t>Monitor 23 privately configured collections for verified BUY NOW listings with product-page Rarity: Exotic. Bids, purchases, wallet operations and payment UI are excluded. Historical Exotic sales are independent of present availability. The approved roster is private and must be supplied on restore; this document is not a collection inventory.</w:t>
       </w:r>
     </w:p>
     <w:p>
@@ -53,7 +48,7 @@
         <w:pStyle w:val="Heading1"/>
       </w:pPr>
       <w:r>
-        <w:t>Scope and safeguards</w:t>
+        <w:t>Actual runtime and cadence</w:t>
       </w:r>
     </w:p>
     <w:p>
@@ -61,7 +56,7 @@
         <w:pStyle w:val="ListBullet"/>
       </w:pPr>
       <w:r>
-        <w:t>Tracks the ten configured collections held privately in the state file.</w:t>
+        <w:t>Hermes no-agent primary run_mcfarlane_exotic_deterministic.py owns a shared execution lease, refreshes current POL/USD, then invokes the Node collector run_mcfarlane_exotic_deterministic.js. Python psutil and the read-only cron execution ledger identify the actual scheduled occurrence.</w:t>
       </w:r>
     </w:p>
     <w:p>
@@ -69,7 +64,7 @@
         <w:pStyle w:val="ListBullet"/>
       </w:pPr>
       <w:r>
-        <w:t>Counts BUY NOW listings only; bids, wallet actions, purchases, and payment UI are out of scope.</w:t>
+        <w:t>Primary schedule: 00:00, 08:00, 12:00, 16:00 and 20:00 America/New_York. WhatsApp downstream: minute 15 of those hours. Priority confirmation: minute 14, not a guaranteed ten minutes after run completion; it can defer while the lease is busy.</w:t>
       </w:r>
     </w:p>
     <w:p>
@@ -77,7 +72,7 @@
         <w:pStyle w:val="ListBullet"/>
       </w:pPr>
       <w:r>
-        <w:t>Runs at 00:00, 08:00, 12:00, 16:00, and 20:00 Eastern; WhatsApp delivery is scheduled 15 minutes after each main interval.</w:t>
+        <w:t>Technical retry scheduler polls each minute; purchase-priority confirmation reads saved candidates first. Empty/not-due stages make no marketplace request.</w:t>
       </w:r>
     </w:p>
     <w:p>
@@ -85,7 +80,7 @@
         <w:pStyle w:val="ListBullet"/>
       </w:pPr>
       <w:r>
-        <w:t>Uses a dedicated, isolated headless Chrome profile only—not the user's normal Chrome profile.</w:t>
+        <w:t>Silent missing-history enrichment polls every 15 minutes, yields to primary/priority/retry work and uses the same lease.</w:t>
       </w:r>
     </w:p>
     <w:p>
@@ -93,7 +88,15 @@
         <w:pStyle w:val="ListBullet"/>
       </w:pPr>
       <w:r>
-        <w:t>Navigates serially with at least a 10-second gap between every marketplace navigation, including product-trait checks.</w:t>
+        <w:t>Browser collection uses Playwright attached to a dedicated Chrome CDP endpoint on IPv6 loopback port 9222. Browser provisioning/supervision is external to the collector. The source does not prove an automatic browser restart service exists.</w:t>
+      </w:r>
+    </w:p>
+    <w:p>
+      <w:pPr>
+        <w:pStyle w:val="Heading1"/>
+      </w:pPr>
+      <w:r>
+        <w:t>Collection, verification and comparison</w:t>
       </w:r>
     </w:p>
     <w:p>
@@ -101,7 +104,47 @@
         <w:pStyle w:val="ListBullet"/>
       </w:pPr>
       <w:r>
-        <w:t>Stops marketplace-wide work only for explicit 429, CAPTCHA/challenge, or access-denied evidence. Redirects, loading shells, missing controls, and timeouts are collection-local failures.</w:t>
+        <w:t>Collection navigation is serial, canonical filtered URLs are checked and BUY NOW cards are verified on token pages for the Exotic trait. Bid-only cards do not become listings. A missing/ambiguous control or loading shell is not proof of an empty collection.</w:t>
+      </w:r>
+    </w:p>
+    <w:p>
+      <w:pPr>
+        <w:pStyle w:val="ListBullet"/>
+      </w:pPr>
+      <w:r>
+        <w:t>The installed collector uses GAP_MS=10000, a 4-second load settle and two collection attempts. This is an implementation fact, not compliance with the saved operating preference for at least 15 seconds. Closing that pacing mismatch requires a separate runtime change.</w:t>
+      </w:r>
+    </w:p>
+    <w:p>
+      <w:pPr>
+        <w:pStyle w:val="ListBullet"/>
+      </w:pPr>
+      <w:r>
+        <w:t>Batch budget is min(1500, max(600, selected collection count × 60 + 120)) seconds; wrapper allowance adds 120 seconds, with preflight/rate-refresh outside that allowance. Scheduler timeout must allow the entire wrapper.</w:t>
+      </w:r>
+    </w:p>
+    <w:p>
+      <w:pPr>
+        <w:pStyle w:val="ListBullet"/>
+      </w:pPr>
+      <w:r>
+        <w:t>Explicit global blocking evidence stops work. Local failures and budget-skipped collections retain last-known-good rows. Checkpoints preserve verified progress; abandoned dedicated-browser pages are closed.</w:t>
+      </w:r>
+    </w:p>
+    <w:p>
+      <w:pPr>
+        <w:pStyle w:val="ListBullet"/>
+      </w:pPr>
+      <w:r>
+        <w:t>Differences are held as candidates until an independent matching observation promotes them. Candidate observations never supply confirmed removals. New token identity or a same-token/same-currency price cut of at least 10% is purchase-priority. Smaller decreases, removals and increases wait for ordinary confirmation.</w:t>
+      </w:r>
+    </w:p>
+    <w:p>
+      <w:pPr>
+        <w:pStyle w:val="ListBullet"/>
+      </w:pPr>
+      <w:r>
+        <w:t>Active seller enrichment uses active order makers and private aliases. Listing set time is separate from collection Activity sale time. Metadata-only, seller-only and valuation changes are not listing-change events.</w:t>
       </w:r>
     </w:p>
     <w:p>
@@ -109,71 +152,55 @@
         <w:pStyle w:val="Heading1"/>
       </w:pPr>
       <w:r>
-        <w:t>Collection verification workflow</w:t>
+        <w:t>Reliability and recovery</w:t>
       </w:r>
     </w:p>
     <w:p>
       <w:pPr>
-        <w:pStyle w:val="ListNumber"/>
+        <w:pStyle w:val="ListBullet"/>
       </w:pPr>
       <w:r>
-        <w:t>Connect to the dedicated Chrome DevTools endpoint.</w:t>
+        <w:t>Python and Node use a shared filesystem lease with inherited owner-token validation. Busy means defer; it must not spend retry budget. Stale leases fail closed and need owner/process inspection rather than blind deletion.</w:t>
       </w:r>
     </w:p>
     <w:p>
       <w:pPr>
-        <w:pStyle w:val="ListNumber"/>
+        <w:pStyle w:val="ListBullet"/>
       </w:pPr>
       <w:r>
-        <w:t>Close abandoned pages in the dedicated monitor profile before beginning a run.</w:t>
+        <w:t>Technical recovery targets unresolved failures only, prioritizing budget-skipped names. Five retry stages use delays 1, 3, 5, 10 and 20 minutes, scheduled relative to each preceding outcome; they are not five absolute offsets from the original failure. Exhaustion is tied to primary generation and cannot be replenished by polling the same generation.</w:t>
       </w:r>
     </w:p>
     <w:p>
       <w:pPr>
-        <w:pStyle w:val="ListNumber"/>
+        <w:pStyle w:val="ListBullet"/>
       </w:pPr>
       <w:r>
-        <w:t>For each saved filtered collection URL, verify the canonical URL retains its requested Exotic and in-stock filter parameters.</w:t>
+        <w:t>A primary partial result is reported once; intermediate incomplete targeted passes are suppressed. The unresolved set and confirmed undelivered deltas survive targeted passes; full recovery emits a resolved report.</w:t>
       </w:r>
     </w:p>
     <w:p>
       <w:pPr>
-        <w:pStyle w:val="ListNumber"/>
+        <w:pStyle w:val="ListBullet"/>
       </w:pPr>
       <w:r>
-        <w:t>Extract only cards clearly marked BUY NOW.</w:t>
+        <w:t>Owed 08:00 heartbeat support now exists: wrapper arms pending8am before collection, Node claims it only after complete recovery and sufficiently fresh observations, and deliver_exotic_owed_heartbeat.py offers a saved-only handoff/status/verified-ledger repair helper. No recurring job for that helper was present in the inspected schedules; normal targeted recovery can claim the debt itself.</w:t>
       </w:r>
     </w:p>
     <w:p>
       <w:pPr>
-        <w:pStyle w:val="ListNumber"/>
+        <w:pStyle w:val="ListBullet"/>
       </w:pPr>
       <w:r>
-        <w:t>For every active candidate, open its product page and require a rendered `Rarity: Exotic` trait before accepting it.</w:t>
+        <w:t>Heartbeat state records generation/handoff before the scheduler's actual Discord send. It is NOT a delivery acknowledgment: a downstream failure can lose the automatic replay opportunity. Runtime support and offline tests are not proof of a live delivered recovery heartbeat. Ledger schema, preserved primary job ID and correct process ancestry are prerequisites.</w:t>
       </w:r>
     </w:p>
     <w:p>
       <w:pPr>
-        <w:pStyle w:val="ListNumber"/>
+        <w:pStyle w:val="ListBullet"/>
       </w:pPr>
       <w:r>
-        <w:t>Normalize listings by token identity, price, currency, and stable private name. Presentation-only card text changes must not create an alert.</w:t>
-      </w:r>
-    </w:p>
-    <w:p>
-      <w:pPr>
-        <w:pStyle w:val="ListNumber"/>
-      </w:pPr>
-      <w:r>
-        <w:t>Retain last-known-good rows on unavailable/partial results and continue with the other collections.</w:t>
-      </w:r>
-    </w:p>
-    <w:p>
-      <w:pPr>
-        <w:pStyle w:val="ListNumber"/>
-      </w:pPr>
-      <w:r>
-        <w:t>Enforce a bounded run budget. If insufficient time remains, return a safe partial result rather than timing out.</w:t>
+        <w:t>At this review's offline regression run, 24 of 25 existing Python reliability/context/enrichment/owed-heartbeat tests passed. The owed-heartbeat seed test failed because required_observation_at was absent instead of the ledger's actual started_at. This is a specific unresolved repair-path freshness gap, not proof that all heartbeat recovery works; rerun after a targeted runtime fix.</w:t>
       </w:r>
     </w:p>
     <w:p>
@@ -181,7 +208,7 @@
         <w:pStyle w:val="Heading1"/>
       </w:pPr>
       <w:r>
-        <w:t>Change confirmation and state</w:t>
+        <w:t>Destination-specific output</w:t>
       </w:r>
     </w:p>
     <w:p>
@@ -189,7 +216,7 @@
         <w:pStyle w:val="ListBullet"/>
       </w:pPr>
       <w:r>
-        <w:t>A newly observed listing, disappearance, count change, token change, price change, or currency change is first held as a candidate.</w:t>
+        <w:t>Ordinary Discord no-change primary results are compact status only, not unchanged collection rows. Confirmed changes contain details only for affected collections and explicit removals, including partial removals.</w:t>
       </w:r>
     </w:p>
     <w:p>
@@ -197,7 +224,7 @@
         <w:pStyle w:val="ListBullet"/>
       </w:pPr>
       <w:r>
-        <w:t>The same normalized difference must appear in the next independent interval before it becomes a verified change.</w:t>
+        <w:t>The actual scheduled primary 08:00 ET occurrence is the compact active-listings exception: one concise collection/price line per active listing, with POL and USD; no seller, history, timestamp or link. Manual runs at 08:00 do not qualify merely because of wall time. If owed, it can accompany the eventual resolved output; already-handed-off dates are not replayed automatically.</w:t>
       </w:r>
     </w:p>
     <w:p>
@@ -205,7 +232,7 @@
         <w:pStyle w:val="ListBullet"/>
       </w:pPr>
       <w:r>
-        <w:t>Candidate or failed observations never overwrite a verified baseline and never create a WhatsApp event.</w:t>
+        <w:t>WhatsApp uses the separate exotic_whatsapp_policy.js and saved-only downstream script. Only independently confirmed new listings and same-token/same-currency decreases of any size are eligible. No removals, increases, unchanged inventory, currency-only or metadata-only changes. The 10% threshold controls urgency, not final WhatsApp eligibility.</w:t>
       </w:r>
     </w:p>
     <w:p>
@@ -213,7 +240,15 @@
         <w:pStyle w:val="ListBullet"/>
       </w:pPr>
       <w:r>
-        <w:t>Verified changes create a deduplicated pending WhatsApp event; delivery records its fingerprint so it cannot send twice.</w:t>
+        <w:t>Downstream stdout is handed to Hermes delivery; consuming a queue is not proof the destination received it. Saved review/preview tools are not part of ordinary delta output.</w:t>
+      </w:r>
+    </w:p>
+    <w:p>
+      <w:pPr>
+        <w:pStyle w:val="Heading1"/>
+      </w:pPr>
+      <w:r>
+        <w:t>Valuation and historical enrichment</w:t>
       </w:r>
     </w:p>
     <w:p>
@@ -221,7 +256,23 @@
         <w:pStyle w:val="ListBullet"/>
       </w:pPr>
       <w:r>
-        <w:t>The collection Activity view remains authoritative for the saved last Exotic-sale price/time. Product pages verify the trait only.</w:t>
+        <w:t>Current POL/USD is refreshed before collection; source failure retains the saved rate and does not intentionally block the collector. Current listing USD is display-only.</w:t>
+      </w:r>
+    </w:p>
+    <w:p>
+      <w:pPr>
+        <w:pStyle w:val="ListBullet"/>
+      </w:pPr>
+      <w:r>
+        <w:t>Last Exotic sale is selected from completed Activity and independently verified on a rendered product trait page. The resumable missing-history worker excludes user-disabled/terminal searches, persists pagination/progress, paces requests and cools down failures. Missing or exhausted history means not verified, never proof of no sale.</w:t>
+      </w:r>
+    </w:p>
+    <w:p>
+      <w:pPr>
+        <w:pStyle w:val="ListBullet"/>
+      </w:pPr>
+      <w:r>
+        <w:t>Saved sale-time priceUsd/amountUsd or historical cached valuation remains historical; do not reprice old sales using current POL spot.</w:t>
       </w:r>
     </w:p>
     <w:p>
@@ -229,150 +280,42 @@
         <w:pStyle w:val="Heading1"/>
       </w:pPr>
       <w:r>
-        <w:t>Notifications</w:t>
-      </w:r>
-    </w:p>
-    <w:p>
-      <w:pPr>
-        <w:pStyle w:val="Heading2"/>
-      </w:pPr>
-      <w:r>
-        <w:t>Discord</w:t>
+        <w:t>Backup, restore and verification boundary</w:t>
       </w:r>
     </w:p>
     <w:p>
       <w:r>
-        <w:t>Discord receives every primary interval report.</w:t>
-      </w:r>
-    </w:p>
-    <w:p>
-      <w:pPr>
-        <w:pStyle w:val="ListBullet"/>
-      </w:pPr>
-      <w:r>
-        <w:t>No verified change: active listings only.</w:t>
-      </w:r>
-    </w:p>
-    <w:p>
-      <w:pPr>
-        <w:pStyle w:val="ListBullet"/>
-      </w:pPr>
-      <w:r>
-        <w:t>Verified change: complete collection status.</w:t>
-      </w:r>
-    </w:p>
-    <w:p>
-      <w:pPr>
-        <w:pStyle w:val="ListBullet"/>
-      </w:pPr>
-      <w:r>
-        <w:t>Partial run: identifies unavailable collections and confirms their last-known-good data was retained.</w:t>
-      </w:r>
-    </w:p>
-    <w:p>
-      <w:pPr>
-        <w:pStyle w:val="ListBullet"/>
-      </w:pPr>
-      <w:r>
-        <w:t>Public formatting uses `POL`, green emphasis for active rows, `last:` for historical sales, and masked no-preview View links.</w:t>
-      </w:r>
-    </w:p>
-    <w:p>
-      <w:pPr>
-        <w:pStyle w:val="Heading2"/>
-      </w:pPr>
-      <w:r>
-        <w:t>WhatsApp</w:t>
+        <w:t>The explicit monitor_backup_manifest.json includes the Python wrapper, Node collector and dynamically required WhatsApp policy, shared lease, technical retries, priority confirmation, spot-rate refresh, missing-history worker, alias resolver code, owed-heartbeat helper and backup/PRD utilities. Only code and these PRDs enter the source snapshot. No live state, raw aliases, wallets, private URLs, destinations, credentials, logs or browser profiles are copied. Python/Node packages are declared dependencies, not bundled binaries.</w:t>
       </w:r>
     </w:p>
     <w:p>
       <w:r>
-        <w:t>WhatsApp receives only a verified, undelivered change event.</w:t>
-      </w:r>
-    </w:p>
-    <w:p>
-      <w:pPr>
-        <w:pStyle w:val="ListBullet"/>
-      </w:pPr>
-      <w:r>
-        <w:t>No change, candidate-only result, or failure-only result returns `[SILENT]`.</w:t>
-      </w:r>
-    </w:p>
-    <w:p>
-      <w:pPr>
-        <w:pStyle w:val="ListBullet"/>
-      </w:pPr>
-      <w:r>
-        <w:t>Messages contain no URLs, token IDs, contract IDs, or NFT item names.</w:t>
-      </w:r>
-    </w:p>
-    <w:p>
-      <w:pPr>
-        <w:pStyle w:val="ListBullet"/>
-      </w:pPr>
-      <w:r>
-        <w:t>Active rows use `🟢 YES`, `POL`, and `Last:`.</w:t>
-      </w:r>
-    </w:p>
-    <w:p>
-      <w:pPr>
-        <w:pStyle w:val="Heading1"/>
-      </w:pPr>
-      <w:r>
-        <w:t>Reliability requirements</w:t>
-      </w:r>
-    </w:p>
-    <w:p>
-      <w:pPr>
-        <w:pStyle w:val="ListNumber"/>
-      </w:pPr>
-      <w:r>
-        <w:t>Dedicated Chrome is reset independently of the user's browser when its monitor-only profile becomes unhealthy.</w:t>
-      </w:r>
-    </w:p>
-    <w:p>
-      <w:pPr>
-        <w:pStyle w:val="ListNumber"/>
-      </w:pPr>
-      <w:r>
-        <w:t>Every run removes stale monitor tabs before collection work.</w:t>
-      </w:r>
-    </w:p>
-    <w:p>
-      <w:pPr>
-        <w:pStyle w:val="ListNumber"/>
-      </w:pPr>
-      <w:r>
-        <w:t>Connection, navigation, loading, product-trait, and budget failures retain state and report partial status rather than producing a false change.</w:t>
-      </w:r>
-    </w:p>
-    <w:p>
-      <w:pPr>
-        <w:pStyle w:val="ListNumber"/>
-      </w:pPr>
-      <w:r>
-        <w:t>No change can be promoted or delivered unless it survives independent-interval confirmation.</w:t>
-      </w:r>
-    </w:p>
-    <w:p>
-      <w:pPr>
-        <w:pStyle w:val="ListNumber"/>
-      </w:pPr>
-      <w:r>
-        <w:t>The monitor's Discord and WhatsApp delivery stages are deterministic no-agent scripts; browser collection does not require an LLM runtime.</w:t>
-      </w:r>
-    </w:p>
-    <w:p>
-      <w:pPr>
-        <w:pStyle w:val="Heading1"/>
-      </w:pPr>
-      <w:r>
-        <w:t>Backup and review</w:t>
+        <w:t>RESTORE.md and restore-config.json describe relocation placeholders, required private configuration, disabled schedule templates, browser/Node installation and controlled rebaseline. This is not a complete stateful disaster-recovery backup: previous dedupe, pending delivery, exact roster and history require separate private recovery. Legacy repository data/history is not retroactively sanitized.</w:t>
       </w:r>
     </w:p>
     <w:p>
       <w:r>
-        <w:t>The sanitized Exotic backup includes this Markdown PRD and its DOCX counterpart. Before the daily Exotic backup evaluates changes, the PRD refresh step reviews the current deterministic implementation and only rewrites the PRD when the tracked implementation signature changed. Private live state, credentials, logs, token identifiers, and source URLs are excluded from the backup.</w:t>
+        <w:t>Automated refresh fingerprints every manifest source plus stable relevant recurring schedule semantics and private roster identity. It marks drift; it never advances a human/substantive review date merely because hashes changed. Markdown content changes regenerate DOCX. Daily backup checks a per-ET-day success/attempt cap before repository mutation, detects identical snapshots, refuses dirty repositories and legacy data artifacts, stages explicit files only and verifies the remote commit after a push. Local snapshot validation does not claim a cloud update.</w:t>
+      </w:r>
+    </w:p>
+    <w:p>
+      <w:r>
+        <w:t>&lt;!-- automated-drift:start --&gt;</w:t>
+      </w:r>
+    </w:p>
+    <w:p>
+      <w:r>
+        <w:t>Observed implementation fingerprint: `938619d219c11d523ea0d3645c408e5f4d70e9d661d7f1232e2d097802e0d8c2`</w:t>
+      </w:r>
+    </w:p>
+    <w:p>
+      <w:r>
+        <w:t>Automated drift status: changed or unreviewed; substantive review required. Hash comparison is not a requirements review.</w:t>
+      </w:r>
+    </w:p>
+    <w:p>
+      <w:r>
+        <w:t>&lt;!-- automated-drift:end --&gt;</w:t>
       </w:r>
     </w:p>
     <w:sectPr>

</xml_diff>

<commit_message>
backup: exotic source snapshot 2026-09-16
</commit_message>
<xml_diff>
--- a/McFarlane_Exotic_Watch_PRD.docx
+++ b/McFarlane_Exotic_Watch_PRD.docx
@@ -17,7 +17,7 @@
     </w:p>
     <w:p>
       <w:r>
-        <w:t>Substantive implementation review: 2026-09-15; local code and recurring configuration only, no live collection or delivery test.</w:t>
+        <w:t>Agent source audit: 2026-09-16; local code and recurring configuration only, no human approval, live collection or delivery test implied.</w:t>
       </w:r>
     </w:p>
     <w:p>
@@ -128,7 +128,7 @@
         <w:pStyle w:val="ListBullet"/>
       </w:pPr>
       <w:r>
-        <w:t>Explicit global blocking evidence stops work. Local failures and budget-skipped collections retain last-known-good rows. Checkpoints preserve verified progress; abandoned dedicated-browser pages are closed.</w:t>
+        <w:t>Explicit global blocking evidence stops work. Local failures and budget-skipped collections retain last-known-good rows. Checkpoints preserve verified progress. The collector creates and closes its own page; it does not enumerate or close unrelated tabs. One bounded owned-page reconnect is permitted within the remaining deadline. Replaced-page cleanup is not guaranteed by the inspected recovery branch.</w:t>
       </w:r>
     </w:p>
     <w:p>
@@ -295,7 +295,12 @@
     </w:p>
     <w:p>
       <w:r>
-        <w:t>Automated refresh fingerprints every manifest source plus stable relevant recurring schedule semantics and private roster identity. It marks drift; it never advances a human/substantive review date merely because hashes changed. Markdown content changes regenerate DOCX. Daily backup checks a per-ET-day success/attempt cap before repository mutation, detects identical snapshots, refuses dirty repositories and legacy data artifacts, stages explicit files only and verifies the remote commit after a push. Local snapshot validation does not claim a cloud update.</w:t>
+        <w:t>Automated refresh fingerprints every manifest source plus stable relevant recurring schedule semantics, private roster identity and allowlisted declarative policies. Declarations may themselves lag code; hashing them does not certify compliance. Observation timestamps, results and delivery queues do not create drift. It never advances a human review date merely because hashes changed. Markdown content changes regenerate DOCX. Daily backup checks a per-ET-day success/attempt cap before repository mutation, detects identical snapshots, refuses dirty repositories and legacy data artifacts, stages explicit files only and verifies the remote commit after a push. Original scheduler IDs are replaced with private restore placeholders; snapshot verification rejects extra files and scans DOCX package text, metadata and external relationships. Local snapshot validation does not claim a cloud update.</w:t>
+      </w:r>
+    </w:p>
+    <w:p>
+      <w:r>
+        <w:t>The enabled daily backup remains at 23:40 America/New_York. Offline readiness is not permission to run a monitor, deliver notifications or push. Existing repository history and legacy non-manifest files require separate review; source-only snapshot validation covers the new snapshot, not historical commits.</w:t>
       </w:r>
     </w:p>
     <w:p>
@@ -305,7 +310,7 @@
     </w:p>
     <w:p>
       <w:r>
-        <w:t>Observed implementation fingerprint: `938619d219c11d523ea0d3645c408e5f4d70e9d661d7f1232e2d097802e0d8c2`</w:t>
+        <w:t>Observed implementation fingerprint: `fc01519200a89916e715d32790f66535ce8f6212573ffd9f134bd8f81f42b9ad`</w:t>
       </w:r>
     </w:p>
     <w:p>

</xml_diff>

<commit_message>
backup: exotic source snapshot 2026-09-23
</commit_message>
<xml_diff>
--- a/McFarlane_Exotic_Watch_PRD.docx
+++ b/McFarlane_Exotic_Watch_PRD.docx
@@ -12,7 +12,7 @@
     </w:p>
     <w:p>
       <w:r>
-        <w:t>Version: 3.0</w:t>
+        <w:t>Version: 4.0</w:t>
       </w:r>
     </w:p>
     <w:p>
@@ -40,7 +40,47 @@
     </w:p>
     <w:p>
       <w:r>
-        <w:t>Monitor 23 privately configured collections for verified BUY NOW listings with product-page Rarity: Exotic. Bids, purchases, wallet operations and payment UI are excluded. Historical Exotic sales are independent of present availability. The approved roster is private and must be supplied on restore; this document is not a collection inventory.</w:t>
+        <w:t>Monitor 23 preserved privately configured Exotic watches plus future Exotic or Legendary watches for verified BUY NOW listings with an exact product-page rarity trait. Each watch identity is exact normalized contract plus rarity, so one contract may be monitored independently for both rarities. Bids, purchases, wallet operations and payment UI are excluded. Historical Exotic sales remain independent of present availability. Legendary v1 covers active listings, independent baselines, candidates, alerts and retry state; it does not add Legendary historical-sale enrichment. The approved roster is private and must be supplied on restore; this document is not a collection inventory.</w:t>
+      </w:r>
+    </w:p>
+    <w:p>
+      <w:pPr>
+        <w:pStyle w:val="Heading1"/>
+      </w:pPr>
+      <w:r>
+        <w:t>Zero-LLM collection management</w:t>
+      </w:r>
+    </w:p>
+    <w:p>
+      <w:pPr>
+        <w:pStyle w:val="ListBullet"/>
+      </w:pPr>
+      <w:r>
+        <w:t>`scripts/rarity_watch_manager.py` accepts JSON and implements Add, Disable, Remove and List Saved without an agent or model call. Polygon contracts must be exactly `0x` plus 40 hexadecimal characters and rarity must be exactly `Exotic` or `Legendary`.</w:t>
+      </w:r>
+    </w:p>
+    <w:p>
+      <w:pPr>
+        <w:pStyle w:val="ListBullet"/>
+      </w:pPr>
+      <w:r>
+        <w:t>Add owns the shared execution lease, deduplicates exact contract+rarity, resolves exact metadata from the local full MTD catalog before an exact Rarible metadata fallback, then invokes the established validating Playwright collector for only that target. Existing inventory becomes the initial baseline and never generates an onboarding change alert. Add is a live operation; Disable, Remove and List Saved make no marketplace/API/browser call and send no notification.</w:t>
+      </w:r>
+    </w:p>
+    <w:p>
+      <w:pPr>
+        <w:pStyle w:val="ListBullet"/>
+      </w:pPr>
+      <w:r>
+        <w:t>State schema v2 adds `rarity`, `watch_key` and `enabled` to each collection. Legacy records migrate to Exotic while preserving baselines, history, observations and delivery state. Legacy candidate keys migrate to exact watch keys. Disable retains saved history; Remove deletes only the exact watch and its exact pending candidate/retry target references.</w:t>
+      </w:r>
+    </w:p>
+    <w:p>
+      <w:pPr>
+        <w:pStyle w:val="ListBullet"/>
+      </w:pPr>
+      <w:r>
+        <w:t>The unified `plugins/rarity-watch-manager` package provides a persistent Hermes Desktop pane backed by `ctx.rest` and the scoped Python plugin API. It never submits a prompt. The pane visibly labels Add as live and provides Add, Disable, Remove and List Saved controls with an in-pane Result region.</w:t>
       </w:r>
     </w:p>
     <w:p>
@@ -104,7 +144,7 @@
         <w:pStyle w:val="ListBullet"/>
       </w:pPr>
       <w:r>
-        <w:t>Collection navigation is serial, canonical filtered URLs are checked and BUY NOW cards are verified on token pages for the Exotic trait. Bid-only cards do not become listings. A missing/ambiguous control or loading shell is not proof of an empty collection.</w:t>
+        <w:t>Collection navigation is serial, canonical rarity-filtered URLs are checked and BUY NOW cards are verified on token pages for the watch's exact Exotic or Legendary trait. Bid-only cards do not become listings. A missing/ambiguous control or loading shell is not proof of an empty collection.</w:t>
       </w:r>
     </w:p>
     <w:p>
@@ -144,7 +184,7 @@
         <w:pStyle w:val="ListBullet"/>
       </w:pPr>
       <w:r>
-        <w:t>Active seller enrichment uses active order makers and private aliases. Listing set time is separate from collection Activity sale time. Metadata-only, seller-only and valuation changes are not listing-change events.</w:t>
+        <w:t>Active seller enrichment uses active order makers and the canonical private `mcfarlane-wallet-aliases.json` database shared with completed-sales and tracked-wallet monitors. Listing set time is separate from collection Activity sale time. Metadata-only, seller-only and valuation changes are not listing-change events. The saved-state-only recurring-wallet audit compares distinct listing/sale/activity occurrences against that shared alias database without marketplace or notification calls.</w:t>
       </w:r>
     </w:p>
     <w:p>
@@ -285,7 +325,7 @@
     </w:p>
     <w:p>
       <w:r>
-        <w:t>The explicit monitor_backup_manifest.json includes the Python wrapper, Node collector and dynamically required WhatsApp policy, shared lease, technical retries, priority confirmation, spot-rate refresh, missing-history worker, alias resolver code, owed-heartbeat helper and backup/PRD utilities. Only code and these PRDs enter the source snapshot. No live state, raw aliases, wallets, private URLs, destinations, credentials, logs or browser profiles are copied. Python/Node packages are declared dependencies, not bundled binaries.</w:t>
+        <w:t>The explicit monitor_backup_manifest.json includes the Python wrapper, Node collector and dynamically required WhatsApp policy, shared lease, rarity manager CLI/API/Desktop plugin and their offline tests, technical retries, priority confirmation, spot-rate refresh, missing-history worker, alias resolver code, owed-heartbeat helper and backup/PRD utilities. Only code and these PRDs enter the source snapshot. No live state, raw aliases, wallets, private URLs, destinations, credentials, logs or browser profiles are copied. Python/Node packages are declared dependencies, not bundled binaries.</w:t>
       </w:r>
     </w:p>
     <w:p>
@@ -310,7 +350,7 @@
     </w:p>
     <w:p>
       <w:r>
-        <w:t>Observed implementation fingerprint: `0a14434d501c364037889cca95d2cf161cca578c13957aa6790d783271b22bfb`</w:t>
+        <w:t>Observed implementation fingerprint: `16072383a3eda24c41ce02bc224b8b34aea7871600259d17037562a0b9e3166b`</w:t>
       </w:r>
     </w:p>
     <w:p>

</xml_diff>

<commit_message>
backup: exotic source snapshot 2026-09-24
</commit_message>
<xml_diff>
--- a/McFarlane_Exotic_Watch_PRD.docx
+++ b/McFarlane_Exotic_Watch_PRD.docx
@@ -64,7 +64,7 @@
         <w:pStyle w:val="ListBullet"/>
       </w:pPr>
       <w:r>
-        <w:t>Add owns the shared execution lease, deduplicates exact contract+rarity, resolves exact metadata from the local full MTD catalog before an exact Rarible metadata fallback, then invokes the established validating Playwright collector for only that target. Existing inventory becomes the initial baseline and never generates an onboarding change alert. Add is a live operation; Disable, Remove and List Saved make no marketplace/API/browser call and send no notification.</w:t>
+        <w:t>Add owns the shared execution lease, deduplicates exact contract+rarity, resolves exact metadata from the local full MTD catalog before an exact Rarible metadata fallback, then invokes the established validating Playwright collector for only that target. Add succeeds only after a verified baseline; failed or ambiguous checks do not save or enable a watch and never claim that nothing is available. Existing inventory becomes the initial baseline and never generates a listing-change alert. After the lease is released, a dedicated deterministic Discord helper posts and reads back one onboarding status in the configured Exotic channel: either verified active BUY NOW listings or an explicit no-active-listings result. A pending notice is persisted before delivery, and resubmitting the exact watch retries that notice without another marketplace check. A baseline-verified watch is enabled for subsequent interval and 8 AM heartbeat reports even if Discord delivery is temporarily pending. Disable, Remove and List Saved make no marketplace/API/browser call and send no notification.</w:t>
       </w:r>
     </w:p>
     <w:p>
@@ -81,6 +81,14 @@
       </w:pPr>
       <w:r>
         <w:t>The unified `plugins/rarity-watch-manager` package provides a persistent Hermes Desktop pane backed by `ctx.rest` and the scoped Python plugin API. It never submits a prompt. The pane visibly labels Add as live and provides Add, Disable, Remove and List Saved controls with an in-pane Result region.</w:t>
+      </w:r>
+    </w:p>
+    <w:p>
+      <w:pPr>
+        <w:pStyle w:val="ListBullet"/>
+      </w:pPr>
+      <w:r>
+        <w:t>`scripts/rarity_watch_portal.py` provides the same contract/rarity/optional display/category form as a standalone loopback browser portal on port 8767. It calls `rarity_watch_manager.py` directly—never a plugin REST route, Hermes agent, prompt, or coding model—so portal operation consumes zero LLM tokens. Add visibly reports Discord delivery as read-back verified or pending; Disable, Remove, and List Saved are identified as saved-state-only. The portal enforces exact loopback Host and Origin, a private persistent CSRF secret that remains valid across server restarts, strict request sizing, exact action/contract/rarity validation, no-store responses, a restrictive CSP, and escaped output. `/health` reports `llm_tokens: 0`.</w:t>
       </w:r>
     </w:p>
     <w:p>
@@ -264,7 +272,7 @@
         <w:pStyle w:val="ListBullet"/>
       </w:pPr>
       <w:r>
-        <w:t>The actual scheduled primary 08:00 ET occurrence is the compact active-listings exception: one concise collection/price line per active listing, with POL and USD; no seller, history, timestamp or link. Manual runs at 08:00 do not qualify merely because of wall time. If owed, it can accompany the eventual resolved output; already-handed-off dates are not replayed automatically.</w:t>
+        <w:t>The actual scheduled primary 08:00 ET occurrence is the compact active-listings exception: one concise collection/price line per active listing, explicitly labeled Exotic or Legendary and sorted by numeric selling price from lowest to highest, with POL and USD plus seller Name Tag or the saved four-character wallet suffix. Manual runs at 08:00 do not qualify merely because of wall time. If owed, it can accompany the eventual resolved output; already-handed-off dates are not replayed automatically.</w:t>
       </w:r>
     </w:p>
     <w:p>
@@ -325,7 +333,7 @@
     </w:p>
     <w:p>
       <w:r>
-        <w:t>The explicit monitor_backup_manifest.json includes the Python wrapper, Node collector and dynamically required WhatsApp policy, shared lease, rarity manager CLI/API/Desktop plugin and their offline tests, technical retries, priority confirmation, spot-rate refresh, missing-history worker, alias resolver code, owed-heartbeat helper and backup/PRD utilities. Only code and these PRDs enter the source snapshot. No live state, raw aliases, wallets, private URLs, destinations, credentials, logs or browser profiles are copied. Python/Node packages are declared dependencies, not bundled binaries.</w:t>
+        <w:t>The explicit monitor_backup_manifest.json includes the Python wrapper, Node collector and dynamically required WhatsApp policy, shared lease, rarity manager CLI/API/Desktop plugin, standalone zero-token loopback portal and their offline tests, technical retries, priority confirmation, spot-rate refresh, missing-history worker, alias resolver code, owed-heartbeat helper and backup/PRD utilities. Only code and these PRDs enter the source snapshot. No live state, raw aliases, wallets, private URLs, destinations, credentials, logs or browser profiles are copied. Python/Node packages are declared dependencies, not bundled binaries.</w:t>
       </w:r>
     </w:p>
     <w:p>
@@ -350,7 +358,7 @@
     </w:p>
     <w:p>
       <w:r>
-        <w:t>Observed implementation fingerprint: `16072383a3eda24c41ce02bc224b8b34aea7871600259d17037562a0b9e3166b`</w:t>
+        <w:t>Observed implementation fingerprint: `e9567384c8451a48698190bd715eba03913cf350512cc5ba17dcc36a6b2a4328`</w:t>
       </w:r>
     </w:p>
     <w:p>

</xml_diff>

<commit_message>
backup: exotic source snapshot 2026-09-30
</commit_message>
<xml_diff>
--- a/McFarlane_Exotic_Watch_PRD.docx
+++ b/McFarlane_Exotic_Watch_PRD.docx
@@ -88,7 +88,7 @@
         <w:pStyle w:val="ListBullet"/>
       </w:pPr>
       <w:r>
-        <w:t>`scripts/rarity_watch_portal.py` provides the same contract/rarity/optional display/category form as a standalone loopback browser portal on port 8767. It calls `rarity_watch_manager.py` directly—never a plugin REST route, Hermes agent, prompt, or coding model—so portal operation consumes zero LLM tokens. Add visibly reports Discord delivery as read-back verified or pending; Disable, Remove, and List Saved are identified as saved-state-only. The portal enforces exact loopback Host and Origin, a private persistent CSRF secret that remains valid across server restarts, strict request sizing, exact action/contract/rarity validation, no-store responses, a restrictive CSP, and escaped output. `/health` reports `llm_tokens: 0`.</w:t>
+        <w:t>`scripts/rarity_watch_portal.py` provides the same contract/rarity/optional display/category form as a standalone loopback browser portal on port 8767. It calls deterministic local code—never a plugin REST route, Hermes agent, prompt, or coding model—so portal operation consumes zero LLM tokens. Add visibly reports Discord delivery as read-back verified or pending; Disable, Remove, and List Saved are identified as saved-state-only. **Run Update + Heartbeat** launches `run_rarity_update_and_heartbeat.py` in the background: it runs the established full collector under the shared lease, delivers and reads back the regular Discord result, and sends a freshly rendered price-sorted heartbeat only after a complete outcome. Partial outcomes deliver their normal status but withhold the heartbeat until all watches resolve. **Update Status** reads its durable local status without live calls. The portal enforces exact loopback Host and Origin, a private persistent CSRF secret that remains valid across server restarts, strict request sizing, exact action/contract/rarity validation, no-store responses, a restrictive CSP, and escaped output. `/health` reports `llm_tokens: 0`.</w:t>
       </w:r>
     </w:p>
     <w:p>
@@ -264,7 +264,7 @@
         <w:pStyle w:val="ListBullet"/>
       </w:pPr>
       <w:r>
-        <w:t>Ordinary Discord no-change primary results are compact status only, not unchanged collection rows. Confirmed changes contain details only for affected collections and explicit removals, including partial removals.</w:t>
+        <w:t>Ordinary Discord no-change primary results are compact status only, not unchanged collection rows. Confirmed changes contain details only for affected collections and explicit removals, including partial removals. When every watch fails because the dedicated CDP browser endpoint is unavailable, Discord receives one three-line shared-browser summary with the affected count, retained-data statement, retry status and last complete check instead of repeating the same connection trace for every watch.</w:t>
       </w:r>
     </w:p>
     <w:p>
@@ -358,7 +358,7 @@
     </w:p>
     <w:p>
       <w:r>
-        <w:t>Observed implementation fingerprint: `e9567384c8451a48698190bd715eba03913cf350512cc5ba17dcc36a6b2a4328`</w:t>
+        <w:t>Observed implementation fingerprint: `6d8005ff19a31e90eb3307b376a7c873e1bf45a2b9965a1bacdad7f078bda39d`</w:t>
       </w:r>
     </w:p>
     <w:p>

</xml_diff>

<commit_message>
backup: exotic source snapshot 2026-10-22
</commit_message>
<xml_diff>
--- a/McFarlane_Exotic_Watch_PRD.docx
+++ b/McFarlane_Exotic_Watch_PRD.docx
@@ -7,27 +7,27 @@
         <w:pStyle w:val="Title"/>
       </w:pPr>
       <w:r>
-        <w:t>Product Requirements Document — McFarlane Exotic Watch</w:t>
+        <w:t>Product Requirements Document — McFarlane Rarity Watch</w:t>
       </w:r>
     </w:p>
     <w:p>
       <w:r>
-        <w:t>Version: 4.0</w:t>
+        <w:t xml:space="preserve">Compatibility filename: `McFarlane_Exotic_Watch_PRD.md`  </w:t>
       </w:r>
     </w:p>
     <w:p>
       <w:r>
-        <w:t>Agent source audit: 2026-09-16; local code and recurring configuration only, no human approval, live collection or delivery test implied.</w:t>
+        <w:t xml:space="preserve">Review date: 2026-10-22  </w:t>
       </w:r>
     </w:p>
     <w:p>
       <w:r>
-        <w:t>Status: Active implementation; deployment and delivery caveats below.</w:t>
+        <w:t xml:space="preserve">Status: Active deterministic implementation with current backup defects.  </w:t>
       </w:r>
     </w:p>
     <w:p>
       <w:r>
-        <w:t>Private state: HERMES_HOME/price-watches/mcfarlane-exotics.json (not backed up).</w:t>
+        <w:t>Verification boundary: Reviewed local source, private state aggregates, `jobs.json`, and local execution records. Offline Python tests and the bundled-Node collector test were run. No marketplace request, browser collection, Discord/WhatsApp post, backup push, or live delivery read-back was performed for this review.</w:t>
       </w:r>
     </w:p>
     <w:p>
@@ -35,12 +35,17 @@
         <w:pStyle w:val="Heading1"/>
       </w:pPr>
       <w:r>
-        <w:t>Purpose and current scope</w:t>
+        <w:t>1. Purpose and current scope</w:t>
       </w:r>
     </w:p>
     <w:p>
       <w:r>
-        <w:t>Monitor 23 preserved privately configured Exotic watches plus future Exotic or Legendary watches for verified BUY NOW listings with an exact product-page rarity trait. Each watch identity is exact normalized contract plus rarity, so one contract may be monitored independently for both rarities. Bids, purchases, wallet operations and payment UI are excluded. Historical Exotic sales remain independent of present availability. Legendary v1 covers active listings, independent baselines, candidates, alerts and retry state; it does not add Legendary historical-sale enrichment. The approved roster is private and must be supplied on restore; this document is not a collection inventory.</w:t>
+        <w:t>The compatibility name understates the implementation. The monitor currently tracks exact Polygon contract-plus-rarity watches for Exotic, Legendary, Epic, and Rare assets. The private saved roster contained 46 enabled watches at review: 22 Exotic, 12 Legendary, 9 Epic, and 3 Rare. These counts were calculated from current state; this document intentionally omits contract addresses, product inventory, aliases, destination identifiers, and marketplace URLs.</w:t>
+      </w:r>
+    </w:p>
+    <w:p>
+      <w:r>
+        <w:t>The monitor detects active BUY NOW listings only after the collection result and product page establish the configured rarity. It does not buy, bid, connect a wallet, or infer rarity from a collection name. Existing inventory is baselined without a change alert.</w:t>
       </w:r>
     </w:p>
     <w:p>
@@ -48,7 +53,7 @@
         <w:pStyle w:val="Heading1"/>
       </w:pPr>
       <w:r>
-        <w:t>Zero-LLM collection management</w:t>
+        <w:t>2. Runtime architecture</w:t>
       </w:r>
     </w:p>
     <w:p>
@@ -56,7 +61,7 @@
         <w:pStyle w:val="ListBullet"/>
       </w:pPr>
       <w:r>
-        <w:t>`scripts/rarity_watch_manager.py` accepts JSON and implements Add, Disable, Remove and List Saved without an agent or model call. Polygon contracts must be exactly `0x` plus 40 hexadecimal characters and rarity must be exactly `Exotic` or `Legendary`.</w:t>
+        <w:t>The scheduled Python wrapper owns the shared execution lease and invokes the Node/Playwright collector attached to a dedicated local browser endpoint.</w:t>
       </w:r>
     </w:p>
     <w:p>
@@ -64,7 +69,7 @@
         <w:pStyle w:val="ListBullet"/>
       </w:pPr>
       <w:r>
-        <w:t>Add owns the shared execution lease, deduplicates exact contract+rarity, resolves exact metadata from the local full MTD catalog before an exact Rarible metadata fallback, then invokes the established validating Playwright collector for only that target. Add succeeds only after a verified baseline; failed or ambiguous checks do not save or enable a watch and never claim that nothing is available. Existing inventory becomes the initial baseline and never generates a listing-change alert. After the lease is released, a dedicated deterministic Discord helper posts and reads back one onboarding status in the configured Exotic channel: either verified active BUY NOW listings or an explicit no-active-listings result. A pending notice is persisted before delivery, and resubmitting the exact watch retries that notice without another marketplace check. A baseline-verified watch is enabled for subsequent interval and 8 AM heartbeat reports even if Discord delivery is temporarily pending. Disable, Remove and List Saved make no marketplace/API/browser call and send no notification.</w:t>
+        <w:t>The deterministic manager and loopback portal support Add, Disable, Remove, List, full update, pending-candidate confirmation, saved-heartbeat resend, and status inspection without an agent/model call.</w:t>
       </w:r>
     </w:p>
     <w:p>
@@ -72,7 +77,7 @@
         <w:pStyle w:val="ListBullet"/>
       </w:pPr>
       <w:r>
-        <w:t>State schema v2 adds `rarity`, `watch_key` and `enabled` to each collection. Legacy records migrate to Exotic while preserving baselines, history, observations and delivery state. Legacy candidate keys migrate to exact watch keys. Disable retains saved history; Remove deletes only the exact watch and its exact pending candidate/retry target references.</w:t>
+        <w:t>Current manager validation allows the four implemented rarities. Each watch is identified by normalized contract plus rarity.</w:t>
       </w:r>
     </w:p>
     <w:p>
@@ -80,7 +85,7 @@
         <w:pStyle w:val="ListBullet"/>
       </w:pPr>
       <w:r>
-        <w:t>The unified `plugins/rarity-watch-manager` package provides a persistent Hermes Desktop pane backed by `ctx.rest` and the scoped Python plugin API. It never submits a prompt. The pane visibly labels Add as live and provides Add, Disable, Remove and List Saved controls with an in-pane Result region.</w:t>
+        <w:t>The collector is serial. It uses a 10-second navigation gap, a 4-second render settle, and at most two measured attempts per collection observation.</w:t>
       </w:r>
     </w:p>
     <w:p>
@@ -88,7 +93,15 @@
         <w:pStyle w:val="ListBullet"/>
       </w:pPr>
       <w:r>
-        <w:t>`scripts/rarity_watch_portal.py` provides the same contract/rarity/optional display/category form as a standalone loopback browser portal on port 8767. It calls deterministic local code—never a plugin REST route, Hermes agent, prompt, or coding model—so portal operation consumes zero LLM tokens. Add visibly reports Discord delivery as read-back verified or pending; Disable, Remove, and List Saved are identified as saved-state-only. **Run Update + Heartbeat** launches `run_rarity_update_and_heartbeat.py` in the background: it runs the established full collector under the shared lease, delivers and reads back the regular Discord result, and sends a freshly rendered price-sorted heartbeat only after a complete outcome. Partial outcomes deliver their normal status but withhold the heartbeat until all watches resolve. **Update Status** reads its durable local status without live calls. The portal enforces exact loopback Host and Origin, a private persistent CSRF secret that remains valid across server restarts, strict request sizing, exact action/contract/rarity validation, no-store responses, a restrictive CSP, and escaped output. `/health` reports `llm_tokens: 0`.</w:t>
+        <w:t>Batch execution is bounded from 600 to 1,500 seconds according to selected-watch count, with additional wrapper allowance.</w:t>
+      </w:r>
+    </w:p>
+    <w:p>
+      <w:pPr>
+        <w:pStyle w:val="ListBullet"/>
+      </w:pPr>
+      <w:r>
+        <w:t>Last-known-good collection baselines survive collection-local failures and budget skips. A global marketplace/browser block stops the run and leaves all baselines unchanged.</w:t>
       </w:r>
     </w:p>
     <w:p>
@@ -96,7 +109,93 @@
         <w:pStyle w:val="Heading1"/>
       </w:pPr>
       <w:r>
-        <w:t>Actual runtime and cadence</w:t>
+        <w:t>3. Confirmed-change semantics</w:t>
+      </w:r>
+    </w:p>
+    <w:p>
+      <w:r>
+        <w:t>A changed collection snapshot becomes a pending candidate. A second matching observation is required before promotion. The current Discord path can report listing additions, removals, and repricing represented by the promoted snapshot; the separate WhatsApp completion path is narrower.</w:t>
+      </w:r>
+    </w:p>
+    <w:p>
+      <w:r>
+        <w:t>The active WhatsApp job runs saved-state processing only. Current policy permits confirmed new listings only, and only for Exotic or Legendary watches. It excludes Epic/Rare, removals, price changes, stale queued offers, and offers no longer present in the verified baseline. This is narrower than older documentation that described lower-price WhatsApp alerts.</w:t>
+      </w:r>
+    </w:p>
+    <w:p>
+      <w:r>
+        <w:t>Seller labels resolve through the shared private alias database when possible; otherwise only a masked suffix is displayed. Full wallets remain private in state.</w:t>
+      </w:r>
+    </w:p>
+    <w:p>
+      <w:pPr>
+        <w:pStyle w:val="Heading1"/>
+      </w:pPr>
+      <w:r>
+        <w:t>4. Authoritative schedules</w:t>
+      </w:r>
+    </w:p>
+    <w:p>
+      <w:r>
+        <w:t>All enabled cron expressions below were read from current `jobs.json`. No relevant job has an explicit per-job timezone field; intended interpretation is America/New_York, but scheduler daylight-saving behavior is not proven by configuration alone.</w:t>
+      </w:r>
+    </w:p>
+    <w:p>
+      <w:r>
+        <w:t>| Function | Current schedule |</w:t>
+      </w:r>
+    </w:p>
+    <w:p>
+      <w:r>
+        <w:t>| --- | --- |</w:t>
+      </w:r>
+    </w:p>
+    <w:p>
+      <w:r>
+        <w:t>| Full rarity collection | 01:00, 09:00, 13:00, 17:00, 21:00 daily |</w:t>
+      </w:r>
+    </w:p>
+    <w:p>
+      <w:r>
+        <w:t>| Purchase-priority/pending confirmation | Every 2 minutes |</w:t>
+      </w:r>
+    </w:p>
+    <w:p>
+      <w:r>
+        <w:t>| Bounded technical retry poll | Every minute |</w:t>
+      </w:r>
+    </w:p>
+    <w:p>
+      <w:r>
+        <w:t>| WhatsApp confirmed-new-listing consumer | Every 2 minutes on odd minutes |</w:t>
+      </w:r>
+    </w:p>
+    <w:p>
+      <w:r>
+        <w:t>| Daily source backup attempt | 23:40 |</w:t>
+      </w:r>
+    </w:p>
+    <w:p>
+      <w:r>
+        <w:t>The daily active-listings heartbeat is tied to the actual 09:00 Eastern scheduled occurrence, not 08:00. A busy full run persists a deferred-primary obligation; a missed 09:00 occurrence is preserved over later busy occurrences. Heartbeat debt is claimed only after a complete sufficiently fresh observation.</w:t>
+      </w:r>
+    </w:p>
+    <w:p>
+      <w:pPr>
+        <w:pStyle w:val="Heading1"/>
+      </w:pPr>
+      <w:r>
+        <w:t>5. State, retention, and privacy</w:t>
+      </w:r>
+    </w:p>
+    <w:p>
+      <w:r>
+        <w:t>Private state stores the roster, current verified baselines, pending candidates, retry generations, onboarding notices, current valuation context, heartbeat debt, and pending delivery data. It is not a public collection inventory.</w:t>
+      </w:r>
+    </w:p>
+    <w:p>
+      <w:r>
+        <w:t>Retention is mixed rather than governed by one policy:</w:t>
       </w:r>
     </w:p>
     <w:p>
@@ -104,7 +203,7 @@
         <w:pStyle w:val="ListBullet"/>
       </w:pPr>
       <w:r>
-        <w:t>Hermes no-agent primary run_mcfarlane_exotic_deterministic.py owns a shared execution lease, refreshes current POL/USD, then invokes the Node collector run_mcfarlane_exotic_deterministic.js. Python psutil and the read-only cron execution ledger identify the actual scheduled occurrence.</w:t>
+        <w:t>Block diagnostics are pruned to the newest **20** records.</w:t>
       </w:r>
     </w:p>
     <w:p>
@@ -112,7 +211,7 @@
         <w:pStyle w:val="ListBullet"/>
       </w:pPr>
       <w:r>
-        <w:t>Primary schedule: 00:00, 08:00, 12:00, 16:00 and 20:00 America/New_York. WhatsApp downstream: minute 15 of those hours. Priority confirmation: minute 14, not a guaranteed ten minutes after run completion; it can defer while the lease is busy.</w:t>
+        <w:t>Current listing baselines and per-watch historical enrichment remain in the main state without a documented age-based purge.</w:t>
       </w:r>
     </w:p>
     <w:p>
@@ -120,7 +219,7 @@
         <w:pStyle w:val="ListBullet"/>
       </w:pPr>
       <w:r>
-        <w:t>Technical retry scheduler polls each minute; purchase-priority confirmation reads saved candidates first. Empty/not-due stages make no marketplace request.</w:t>
+        <w:t>Pending delivery/retry/onboarding records remain until their code path resolves or explicitly removes them.</w:t>
       </w:r>
     </w:p>
     <w:p>
@@ -128,7 +227,20 @@
         <w:pStyle w:val="ListBullet"/>
       </w:pPr>
       <w:r>
-        <w:t>Silent missing-history enrichment polls every 15 minutes, yields to primary/priority/retry work and uses the same lease.</w:t>
+        <w:t>Browser profile data, logs, credentials, aliases, wallets, destination IDs, and state are private and excluded from source snapshots.</w:t>
+      </w:r>
+    </w:p>
+    <w:p>
+      <w:r>
+        <w:t>Any future retention change must preserve unresolved delivery and heartbeat obligations before deleting historical records.</w:t>
+      </w:r>
+    </w:p>
+    <w:p>
+      <w:pPr>
+        <w:pStyle w:val="Heading1"/>
+      </w:pPr>
+      <w:r>
+        <w:t>6. Failure and recovery behavior</w:t>
       </w:r>
     </w:p>
     <w:p>
@@ -136,7 +248,47 @@
         <w:pStyle w:val="ListBullet"/>
       </w:pPr>
       <w:r>
-        <w:t>Browser collection uses Playwright attached to a dedicated Chrome CDP endpoint on IPv6 loopback port 9222. Browser provisioning/supervision is external to the collector. The source does not prove an automatic browser restart service exists.</w:t>
+        <w:t>Lease contention defers work and does not consume retry budget. Stale lease recovery requires process-owner validation; age alone is insufficient.</w:t>
+      </w:r>
+    </w:p>
+    <w:p>
+      <w:pPr>
+        <w:pStyle w:val="ListBullet"/>
+      </w:pPr>
+      <w:r>
+        <w:t>Local collection failure retains that watch’s prior baseline. A complete-success heartbeat is withheld when any required watch is unresolved.</w:t>
+      </w:r>
+    </w:p>
+    <w:p>
+      <w:pPr>
+        <w:pStyle w:val="ListBullet"/>
+      </w:pPr>
+      <w:r>
+        <w:t>Technical retries target unresolved watches in bounded stages. A recurring one-minute poll does not mean a marketplace call occurs every minute.</w:t>
+      </w:r>
+    </w:p>
+    <w:p>
+      <w:pPr>
+        <w:pStyle w:val="ListBullet"/>
+      </w:pPr>
+      <w:r>
+        <w:t>Browser/CDP unavailability produces a shared failure summary and keeps last-known-good data.</w:t>
+      </w:r>
+    </w:p>
+    <w:p>
+      <w:pPr>
+        <w:pStyle w:val="ListBullet"/>
+      </w:pPr>
+      <w:r>
+        <w:t>Delivery ledgers and exact read-back helpers reduce duplicates but do not prove unconditional exactly-once delivery across unknown network outcomes.</w:t>
+      </w:r>
+    </w:p>
+    <w:p>
+      <w:pPr>
+        <w:pStyle w:val="ListBullet"/>
+      </w:pPr>
+      <w:r>
+        <w:t>The scheduler’s `completed` status establishes process completion only; it does not independently prove collection completeness or destination receipt.</w:t>
       </w:r>
     </w:p>
     <w:p>
@@ -144,55 +296,22 @@
         <w:pStyle w:val="Heading1"/>
       </w:pPr>
       <w:r>
-        <w:t>Collection, verification and comparison</w:t>
+        <w:t>7. Current operational errors and backup gaps</w:t>
       </w:r>
     </w:p>
     <w:p>
-      <w:pPr>
-        <w:pStyle w:val="ListBullet"/>
-      </w:pPr>
       <w:r>
-        <w:t>Collection navigation is serial, canonical rarity-filtered URLs are checked and BUY NOW cards are verified on token pages for the watch's exact Exotic or Legendary trait. Bid-only cards do not become listings. A missing/ambiguous control or loading shell is not proof of an empty collection.</w:t>
+        <w:t>As of the review date, the latest primary and frequent support jobs had completed ledger records, but the daily Exotic backup has an open failure. The current scheduler environment cannot import the DOCX library used by the PRD refresher. This review did not repair it because DOCX generation and runtime changes were explicitly out of scope.</w:t>
       </w:r>
     </w:p>
     <w:p>
-      <w:pPr>
-        <w:pStyle w:val="ListBullet"/>
-      </w:pPr>
       <w:r>
-        <w:t>The installed collector uses GAP_MS=10000, a 4-second load settle and two collection attempts. This is an implementation fact, not compliance with the saved operating preference for at least 15 seconds. Closing that pacing mismatch requires a separate runtime change.</w:t>
+        <w:t>The source-only backup manifest also omits a local browser-recovery module imported by the retry path. The backup import-closure test therefore failed. The bundled Node runtime passed the collector tests; the shell-default Node runtime was too old for the installed Playwright version. Scheduled code should continue to use the configured bundled runtime rather than assuming `node` on PATH is sufficient.</w:t>
       </w:r>
     </w:p>
     <w:p>
-      <w:pPr>
-        <w:pStyle w:val="ListBullet"/>
-      </w:pPr>
       <w:r>
-        <w:t>Batch budget is min(1500, max(600, selected collection count × 60 + 120)) seconds; wrapper allowance adds 120 seconds, with preflight/rate-refresh outside that allowance. Scheduler timeout must allow the entire wrapper.</w:t>
-      </w:r>
-    </w:p>
-    <w:p>
-      <w:pPr>
-        <w:pStyle w:val="ListBullet"/>
-      </w:pPr>
-      <w:r>
-        <w:t>Explicit global blocking evidence stops work. Local failures and budget-skipped collections retain last-known-good rows. Checkpoints preserve verified progress. The collector creates and closes its own page; it does not enumerate or close unrelated tabs. One bounded owned-page reconnect is permitted within the remaining deadline. Replaced-page cleanup is not guaranteed by the inspected recovery branch.</w:t>
-      </w:r>
-    </w:p>
-    <w:p>
-      <w:pPr>
-        <w:pStyle w:val="ListBullet"/>
-      </w:pPr>
-      <w:r>
-        <w:t>Differences are held as candidates until an independent matching observation promotes them. Candidate observations never supply confirmed removals. New token identity or a same-token/same-currency price cut of at least 10% is purchase-priority. Smaller decreases, removals and increases wait for ordinary confirmation.</w:t>
-      </w:r>
-    </w:p>
-    <w:p>
-      <w:pPr>
-        <w:pStyle w:val="ListBullet"/>
-      </w:pPr>
-      <w:r>
-        <w:t>Active seller enrichment uses active order makers and the canonical private `mcfarlane-wallet-aliases.json` database shared with completed-sales and tracked-wallet monitors. Listing set time is separate from collection Activity sale time. Metadata-only, seller-only and valuation changes are not listing-change events. The saved-state-only recurring-wallet audit compares distinct listing/sale/activity occurrences against that shared alias database without marketplace or notification calls.</w:t>
+        <w:t>The source backup intentionally excludes all live state. Even after the manifest and dependency defects are fixed, source backup alone cannot restore roster identity, baselines, dedupe, pending alerts, heartbeat debt, aliases, browser profile, credentials, or destination mapping.</w:t>
       </w:r>
     </w:p>
     <w:p>
@@ -200,155 +319,17 @@
         <w:pStyle w:val="Heading1"/>
       </w:pPr>
       <w:r>
-        <w:t>Reliability and recovery</w:t>
-      </w:r>
-    </w:p>
-    <w:p>
-      <w:pPr>
-        <w:pStyle w:val="ListBullet"/>
-      </w:pPr>
-      <w:r>
-        <w:t>Python and Node use a shared filesystem lease with inherited owner-token validation. Busy means defer; it must not spend retry budget. Stale leases fail closed and need owner/process inspection rather than blind deletion.</w:t>
-      </w:r>
-    </w:p>
-    <w:p>
-      <w:pPr>
-        <w:pStyle w:val="ListBullet"/>
-      </w:pPr>
-      <w:r>
-        <w:t>Technical recovery targets unresolved failures only, prioritizing budget-skipped names. Five retry stages use delays 1, 3, 5, 10 and 20 minutes, scheduled relative to each preceding outcome; they are not five absolute offsets from the original failure. Exhaustion is tied to primary generation and cannot be replenished by polling the same generation.</w:t>
-      </w:r>
-    </w:p>
-    <w:p>
-      <w:pPr>
-        <w:pStyle w:val="ListBullet"/>
-      </w:pPr>
-      <w:r>
-        <w:t>A primary partial result is reported once; intermediate incomplete targeted passes are suppressed. The unresolved set and confirmed undelivered deltas survive targeted passes; full recovery emits a resolved report.</w:t>
-      </w:r>
-    </w:p>
-    <w:p>
-      <w:pPr>
-        <w:pStyle w:val="ListBullet"/>
-      </w:pPr>
-      <w:r>
-        <w:t>Owed 08:00 heartbeat support now exists: wrapper arms pending8am before collection, Node claims it only after complete recovery and sufficiently fresh observations, and deliver_exotic_owed_heartbeat.py offers a saved-only handoff/status/verified-ledger repair helper. No recurring job for that helper was present in the inspected schedules; normal targeted recovery can claim the debt itself.</w:t>
-      </w:r>
-    </w:p>
-    <w:p>
-      <w:pPr>
-        <w:pStyle w:val="ListBullet"/>
-      </w:pPr>
-      <w:r>
-        <w:t>Heartbeat state records generation/handoff before the scheduler's actual Discord send. It is NOT a delivery acknowledgment: a downstream failure can lose the automatic replay opportunity. Runtime support and offline tests are not proof of a live delivered recovery heartbeat. Ledger schema, preserved primary job ID and correct process ancestry are prerequisites.</w:t>
-      </w:r>
-    </w:p>
-    <w:p>
-      <w:pPr>
-        <w:pStyle w:val="ListBullet"/>
-      </w:pPr>
-      <w:r>
-        <w:t>At this review's offline regression run, 24 of 25 existing Python reliability/context/enrichment/owed-heartbeat tests passed. The owed-heartbeat seed test failed because required_observation_at was absent instead of the ledger's actual started_at. This is a specific unresolved repair-path freshness gap, not proof that all heartbeat recovery works; rerun after a targeted runtime fix.</w:t>
-      </w:r>
-    </w:p>
-    <w:p>
-      <w:pPr>
-        <w:pStyle w:val="Heading1"/>
-      </w:pPr>
-      <w:r>
-        <w:t>Destination-specific output</w:t>
-      </w:r>
-    </w:p>
-    <w:p>
-      <w:pPr>
-        <w:pStyle w:val="ListBullet"/>
-      </w:pPr>
-      <w:r>
-        <w:t>Ordinary Discord no-change primary results are compact status only, not unchanged collection rows. Confirmed changes contain details only for affected collections and explicit removals, including partial removals. When every watch fails because the dedicated CDP browser endpoint is unavailable, Discord receives one three-line shared-browser summary with the affected count, retained-data statement, retry status and last complete check instead of repeating the same connection trace for every watch.</w:t>
-      </w:r>
-    </w:p>
-    <w:p>
-      <w:pPr>
-        <w:pStyle w:val="ListBullet"/>
-      </w:pPr>
-      <w:r>
-        <w:t>The actual scheduled primary 08:00 ET occurrence is the compact active-listings exception: one concise collection/price line per active listing, explicitly labeled Exotic or Legendary and sorted by numeric selling price from lowest to highest, with POL and USD plus seller Name Tag or the saved four-character wallet suffix. Manual runs at 08:00 do not qualify merely because of wall time. If owed, it can accompany the eventual resolved output; already-handed-off dates are not replayed automatically.</w:t>
-      </w:r>
-    </w:p>
-    <w:p>
-      <w:pPr>
-        <w:pStyle w:val="ListBullet"/>
-      </w:pPr>
-      <w:r>
-        <w:t>WhatsApp uses the separate exotic_whatsapp_policy.js and saved-only downstream script. Only independently confirmed new listings and same-token/same-currency decreases of any size are eligible. No removals, increases, unchanged inventory, currency-only or metadata-only changes. The 10% threshold controls urgency, not final WhatsApp eligibility.</w:t>
-      </w:r>
-    </w:p>
-    <w:p>
-      <w:pPr>
-        <w:pStyle w:val="ListBullet"/>
-      </w:pPr>
-      <w:r>
-        <w:t>Downstream stdout is handed to Hermes delivery; consuming a queue is not proof the destination received it. Saved review/preview tools are not part of ordinary delta output.</w:t>
-      </w:r>
-    </w:p>
-    <w:p>
-      <w:pPr>
-        <w:pStyle w:val="Heading1"/>
-      </w:pPr>
-      <w:r>
-        <w:t>Valuation and historical enrichment</w:t>
-      </w:r>
-    </w:p>
-    <w:p>
-      <w:pPr>
-        <w:pStyle w:val="ListBullet"/>
-      </w:pPr>
-      <w:r>
-        <w:t>Current POL/USD is refreshed before collection; source failure retains the saved rate and does not intentionally block the collector. Current listing USD is display-only.</w:t>
-      </w:r>
-    </w:p>
-    <w:p>
-      <w:pPr>
-        <w:pStyle w:val="ListBullet"/>
-      </w:pPr>
-      <w:r>
-        <w:t>Last Exotic sale is selected from completed Activity and independently verified on a rendered product trait page. The resumable missing-history worker excludes user-disabled/terminal searches, persists pagination/progress, paces requests and cools down failures. Missing or exhausted history means not verified, never proof of no sale.</w:t>
-      </w:r>
-    </w:p>
-    <w:p>
-      <w:pPr>
-        <w:pStyle w:val="ListBullet"/>
-      </w:pPr>
-      <w:r>
-        <w:t>Saved sale-time priceUsd/amountUsd or historical cached valuation remains historical; do not reprice old sales using current POL spot.</w:t>
-      </w:r>
-    </w:p>
-    <w:p>
-      <w:pPr>
-        <w:pStyle w:val="Heading1"/>
-      </w:pPr>
-      <w:r>
-        <w:t>Backup, restore and verification boundary</w:t>
+        <w:t>8. Acceptance and verification boundaries</w:t>
       </w:r>
     </w:p>
     <w:p>
       <w:r>
-        <w:t>The explicit monitor_backup_manifest.json includes the Python wrapper, Node collector and dynamically required WhatsApp policy, shared lease, rarity manager CLI/API/Desktop plugin, standalone zero-token loopback portal and their offline tests, technical retries, priority confirmation, spot-rate refresh, missing-history worker, alias resolver code, owed-heartbeat helper and backup/PRD utilities. Only code and these PRDs enter the source snapshot. No live state, raw aliases, wallets, private URLs, destinations, credentials, logs or browser profiles are copied. Python/Node packages are declared dependencies, not bundled binaries.</w:t>
+        <w:t>Offline review verified the 46-watch rarity totals programmatically, the five primary daily occurrences and support schedules from `jobs.json`, Python reliability/portal/manager tests, and the Node collector test using the bundled runtime. It did not verify present marketplace contents, browser health, provider completeness, current destination permissions, any actual message, or any remote backup commit.</w:t>
       </w:r>
     </w:p>
     <w:p>
       <w:r>
-        <w:t>RESTORE.md and restore-config.json describe relocation placeholders, required private configuration, disabled schedule templates, browser/Node installation and controlled rebaseline. This is not a complete stateful disaster-recovery backup: previous dedupe, pending delivery, exact roster and history require separate private recovery. Legacy repository data/history is not retroactively sanitized.</w:t>
-      </w:r>
-    </w:p>
-    <w:p>
-      <w:r>
-        <w:t>Automated refresh fingerprints every manifest source plus stable relevant recurring schedule semantics, private roster identity and allowlisted declarative policies. Declarations may themselves lag code; hashing them does not certify compliance. Observation timestamps, results and delivery queues do not create drift. It never advances a human review date merely because hashes changed. Markdown content changes regenerate DOCX. Daily backup checks a per-ET-day success/attempt cap before repository mutation, detects identical snapshots, refuses dirty repositories and legacy data artifacts, stages explicit files only and verifies the remote commit after a push. Original scheduler IDs are replaced with private restore placeholders; snapshot verification rejects extra files and scans DOCX package text, metadata and external relationships. Local snapshot validation does not claim a cloud update.</w:t>
-      </w:r>
-    </w:p>
-    <w:p>
-      <w:r>
-        <w:t>The enabled daily backup remains at 23:40 America/New_York. Offline readiness is not permission to run a monitor, deliver notifications or push. Existing repository history and legacy non-manifest files require separate review; source-only snapshot validation covers the new snapshot, not historical commits.</w:t>
+        <w:t>A future operational sign-off requires: a complete scheduled collection, heartbeat/delta delivery read-back, scheduler timezone/DST evidence, corrected backup dependency/import closure, and a verified private-state recovery procedure.</w:t>
       </w:r>
     </w:p>
     <w:p>
@@ -358,7 +339,7 @@
     </w:p>
     <w:p>
       <w:r>
-        <w:t>Observed implementation fingerprint: `6d8005ff19a31e90eb3307b376a7c873e1bf45a2b9965a1bacdad7f078bda39d`</w:t>
+        <w:t>Observed implementation fingerprint: `3c609b3c538c372a6c30e78b0048c3d2e816669ae7eea025d5294d026401218c`</w:t>
       </w:r>
     </w:p>
     <w:p>

</xml_diff>